<commit_message>
docs: cap nhat file word bao cao tien do
</commit_message>
<xml_diff>
--- a/Slot14/Bao_cao_tien_do_Thymeleaf_SpringDataJPA.docx
+++ b/Slot14/Bao_cao_tien_do_Thymeleaf_SpringDataJPA.docx
@@ -123,12 +123,26 @@
       </w:r>
     </w:p>
     <w:p>
-      <w:r>
+      <w:pPr>
+        <w:rPr>
+          <w:sz w:val="28"/>
+          <w:szCs w:val="28"/>
+        </w:rPr>
+      </w:pPr>
+      <w:r>
+        <w:rPr>
+          <w:sz w:val="28"/>
+          <w:szCs w:val="28"/>
+        </w:rPr>
         <w:t>MỤC LỤC</w:t>
       </w:r>
     </w:p>
     <w:sdt>
       <w:sdtPr>
+        <w:rPr>
+          <w:sz w:val="26"/>
+          <w:szCs w:val="26"/>
+        </w:rPr>
         <w:alias w:val="Mục lục"/>
         <w:id w:val="-1840838080"/>
       </w:sdtPr>
@@ -143,18 +157,30 @@
               <w:rFonts w:asciiTheme="minorHAnsi" w:eastAsiaTheme="minorEastAsia" w:hAnsiTheme="minorHAnsi" w:cstheme="minorBidi"/>
               <w:noProof/>
               <w:kern w:val="2"/>
-              <w:sz w:val="24"/>
-              <w:szCs w:val="24"/>
+              <w:sz w:val="26"/>
+              <w:szCs w:val="26"/>
               <w14:ligatures w14:val="standardContextual"/>
             </w:rPr>
           </w:pPr>
           <w:r>
+            <w:rPr>
+              <w:sz w:val="26"/>
+              <w:szCs w:val="26"/>
+            </w:rPr>
             <w:fldChar w:fldCharType="begin"/>
           </w:r>
           <w:r>
+            <w:rPr>
+              <w:sz w:val="26"/>
+              <w:szCs w:val="26"/>
+            </w:rPr>
             <w:instrText>TOC \h \o "1-2"</w:instrText>
           </w:r>
           <w:r>
+            <w:rPr>
+              <w:sz w:val="26"/>
+              <w:szCs w:val="26"/>
+            </w:rPr>
             <w:fldChar w:fldCharType="separate"/>
           </w:r>
           <w:hyperlink w:anchor="_Toc243990639" w:history="1">
@@ -162,47 +188,63 @@
               <w:rPr>
                 <w:rStyle w:val="Hyperlink"/>
                 <w:noProof/>
+                <w:sz w:val="26"/>
+                <w:szCs w:val="26"/>
               </w:rPr>
               <w:t>Bước 1. Khởi tạo dự án Spring Boot</w:t>
             </w:r>
             <w:r>
               <w:rPr>
                 <w:noProof/>
+                <w:sz w:val="26"/>
+                <w:szCs w:val="26"/>
               </w:rPr>
               <w:tab/>
             </w:r>
             <w:r>
               <w:rPr>
                 <w:noProof/>
+                <w:sz w:val="26"/>
+                <w:szCs w:val="26"/>
               </w:rPr>
               <w:fldChar w:fldCharType="begin"/>
             </w:r>
             <w:r>
               <w:rPr>
                 <w:noProof/>
+                <w:sz w:val="26"/>
+                <w:szCs w:val="26"/>
               </w:rPr>
               <w:instrText xml:space="preserve"> PAGEREF _Toc243990639 \h </w:instrText>
             </w:r>
             <w:r>
               <w:rPr>
                 <w:noProof/>
-              </w:rPr>
-            </w:r>
-            <w:r>
-              <w:rPr>
-                <w:noProof/>
+                <w:sz w:val="26"/>
+                <w:szCs w:val="26"/>
+              </w:rPr>
+            </w:r>
+            <w:r>
+              <w:rPr>
+                <w:noProof/>
+                <w:sz w:val="26"/>
+                <w:szCs w:val="26"/>
               </w:rPr>
               <w:fldChar w:fldCharType="separate"/>
             </w:r>
             <w:r>
               <w:rPr>
                 <w:noProof/>
+                <w:sz w:val="26"/>
+                <w:szCs w:val="26"/>
               </w:rPr>
               <w:t>3</w:t>
             </w:r>
             <w:r>
               <w:rPr>
                 <w:noProof/>
+                <w:sz w:val="26"/>
+                <w:szCs w:val="26"/>
               </w:rPr>
               <w:fldChar w:fldCharType="end"/>
             </w:r>
@@ -218,8 +260,8 @@
               <w:rFonts w:asciiTheme="minorHAnsi" w:eastAsiaTheme="minorEastAsia" w:hAnsiTheme="minorHAnsi" w:cstheme="minorBidi"/>
               <w:noProof/>
               <w:kern w:val="2"/>
-              <w:sz w:val="24"/>
-              <w:szCs w:val="24"/>
+              <w:sz w:val="26"/>
+              <w:szCs w:val="26"/>
               <w14:ligatures w14:val="standardContextual"/>
             </w:rPr>
           </w:pPr>
@@ -228,47 +270,63 @@
               <w:rPr>
                 <w:rStyle w:val="Hyperlink"/>
                 <w:noProof/>
+                <w:sz w:val="26"/>
+                <w:szCs w:val="26"/>
               </w:rPr>
               <w:t>1.1. Tạo dự án Spring Boot</w:t>
             </w:r>
             <w:r>
               <w:rPr>
                 <w:noProof/>
+                <w:sz w:val="26"/>
+                <w:szCs w:val="26"/>
               </w:rPr>
               <w:tab/>
             </w:r>
             <w:r>
               <w:rPr>
                 <w:noProof/>
+                <w:sz w:val="26"/>
+                <w:szCs w:val="26"/>
               </w:rPr>
               <w:fldChar w:fldCharType="begin"/>
             </w:r>
             <w:r>
               <w:rPr>
                 <w:noProof/>
+                <w:sz w:val="26"/>
+                <w:szCs w:val="26"/>
               </w:rPr>
               <w:instrText xml:space="preserve"> PAGEREF _Toc243990640 \h </w:instrText>
             </w:r>
             <w:r>
               <w:rPr>
                 <w:noProof/>
-              </w:rPr>
-            </w:r>
-            <w:r>
-              <w:rPr>
-                <w:noProof/>
+                <w:sz w:val="26"/>
+                <w:szCs w:val="26"/>
+              </w:rPr>
+            </w:r>
+            <w:r>
+              <w:rPr>
+                <w:noProof/>
+                <w:sz w:val="26"/>
+                <w:szCs w:val="26"/>
               </w:rPr>
               <w:fldChar w:fldCharType="separate"/>
             </w:r>
             <w:r>
               <w:rPr>
                 <w:noProof/>
+                <w:sz w:val="26"/>
+                <w:szCs w:val="26"/>
               </w:rPr>
               <w:t>3</w:t>
             </w:r>
             <w:r>
               <w:rPr>
                 <w:noProof/>
+                <w:sz w:val="26"/>
+                <w:szCs w:val="26"/>
               </w:rPr>
               <w:fldChar w:fldCharType="end"/>
             </w:r>
@@ -284,8 +342,8 @@
               <w:rFonts w:asciiTheme="minorHAnsi" w:eastAsiaTheme="minorEastAsia" w:hAnsiTheme="minorHAnsi" w:cstheme="minorBidi"/>
               <w:noProof/>
               <w:kern w:val="2"/>
-              <w:sz w:val="24"/>
-              <w:szCs w:val="24"/>
+              <w:sz w:val="26"/>
+              <w:szCs w:val="26"/>
               <w14:ligatures w14:val="standardContextual"/>
             </w:rPr>
           </w:pPr>
@@ -294,47 +352,63 @@
               <w:rPr>
                 <w:rStyle w:val="Hyperlink"/>
                 <w:noProof/>
+                <w:sz w:val="26"/>
+                <w:szCs w:val="26"/>
               </w:rPr>
               <w:t>1.2. Cấu hình dependencies &amp; build dự án</w:t>
             </w:r>
             <w:r>
               <w:rPr>
                 <w:noProof/>
+                <w:sz w:val="26"/>
+                <w:szCs w:val="26"/>
               </w:rPr>
               <w:tab/>
             </w:r>
             <w:r>
               <w:rPr>
                 <w:noProof/>
+                <w:sz w:val="26"/>
+                <w:szCs w:val="26"/>
               </w:rPr>
               <w:fldChar w:fldCharType="begin"/>
             </w:r>
             <w:r>
               <w:rPr>
                 <w:noProof/>
+                <w:sz w:val="26"/>
+                <w:szCs w:val="26"/>
               </w:rPr>
               <w:instrText xml:space="preserve"> PAGEREF _Toc243990641 \h </w:instrText>
             </w:r>
             <w:r>
               <w:rPr>
                 <w:noProof/>
-              </w:rPr>
-            </w:r>
-            <w:r>
-              <w:rPr>
-                <w:noProof/>
+                <w:sz w:val="26"/>
+                <w:szCs w:val="26"/>
+              </w:rPr>
+            </w:r>
+            <w:r>
+              <w:rPr>
+                <w:noProof/>
+                <w:sz w:val="26"/>
+                <w:szCs w:val="26"/>
               </w:rPr>
               <w:fldChar w:fldCharType="separate"/>
             </w:r>
             <w:r>
               <w:rPr>
                 <w:noProof/>
+                <w:sz w:val="26"/>
+                <w:szCs w:val="26"/>
               </w:rPr>
               <w:t>3</w:t>
             </w:r>
             <w:r>
               <w:rPr>
                 <w:noProof/>
+                <w:sz w:val="26"/>
+                <w:szCs w:val="26"/>
               </w:rPr>
               <w:fldChar w:fldCharType="end"/>
             </w:r>
@@ -350,8 +424,8 @@
               <w:rFonts w:asciiTheme="minorHAnsi" w:eastAsiaTheme="minorEastAsia" w:hAnsiTheme="minorHAnsi" w:cstheme="minorBidi"/>
               <w:noProof/>
               <w:kern w:val="2"/>
-              <w:sz w:val="24"/>
-              <w:szCs w:val="24"/>
+              <w:sz w:val="26"/>
+              <w:szCs w:val="26"/>
               <w14:ligatures w14:val="standardContextual"/>
             </w:rPr>
           </w:pPr>
@@ -360,47 +434,63 @@
               <w:rPr>
                 <w:rStyle w:val="Hyperlink"/>
                 <w:noProof/>
+                <w:sz w:val="26"/>
+                <w:szCs w:val="26"/>
               </w:rPr>
               <w:t>Bước 2. Tích hợp thư viện Bootstrap Offline</w:t>
             </w:r>
             <w:r>
               <w:rPr>
                 <w:noProof/>
+                <w:sz w:val="26"/>
+                <w:szCs w:val="26"/>
               </w:rPr>
               <w:tab/>
             </w:r>
             <w:r>
               <w:rPr>
                 <w:noProof/>
+                <w:sz w:val="26"/>
+                <w:szCs w:val="26"/>
               </w:rPr>
               <w:fldChar w:fldCharType="begin"/>
             </w:r>
             <w:r>
               <w:rPr>
                 <w:noProof/>
+                <w:sz w:val="26"/>
+                <w:szCs w:val="26"/>
               </w:rPr>
               <w:instrText xml:space="preserve"> PAGEREF _Toc243990642 \h </w:instrText>
             </w:r>
             <w:r>
               <w:rPr>
                 <w:noProof/>
-              </w:rPr>
-            </w:r>
-            <w:r>
-              <w:rPr>
-                <w:noProof/>
+                <w:sz w:val="26"/>
+                <w:szCs w:val="26"/>
+              </w:rPr>
+            </w:r>
+            <w:r>
+              <w:rPr>
+                <w:noProof/>
+                <w:sz w:val="26"/>
+                <w:szCs w:val="26"/>
               </w:rPr>
               <w:fldChar w:fldCharType="separate"/>
             </w:r>
             <w:r>
               <w:rPr>
                 <w:noProof/>
+                <w:sz w:val="26"/>
+                <w:szCs w:val="26"/>
               </w:rPr>
               <w:t>3</w:t>
             </w:r>
             <w:r>
               <w:rPr>
                 <w:noProof/>
+                <w:sz w:val="26"/>
+                <w:szCs w:val="26"/>
               </w:rPr>
               <w:fldChar w:fldCharType="end"/>
             </w:r>
@@ -416,8 +506,8 @@
               <w:rFonts w:asciiTheme="minorHAnsi" w:eastAsiaTheme="minorEastAsia" w:hAnsiTheme="minorHAnsi" w:cstheme="minorBidi"/>
               <w:noProof/>
               <w:kern w:val="2"/>
-              <w:sz w:val="24"/>
-              <w:szCs w:val="24"/>
+              <w:sz w:val="26"/>
+              <w:szCs w:val="26"/>
               <w14:ligatures w14:val="standardContextual"/>
             </w:rPr>
           </w:pPr>
@@ -426,47 +516,63 @@
               <w:rPr>
                 <w:rStyle w:val="Hyperlink"/>
                 <w:noProof/>
+                <w:sz w:val="26"/>
+                <w:szCs w:val="26"/>
               </w:rPr>
               <w:t>2.1. Cài đặt Bootstrap offline</w:t>
             </w:r>
             <w:r>
               <w:rPr>
                 <w:noProof/>
+                <w:sz w:val="26"/>
+                <w:szCs w:val="26"/>
               </w:rPr>
               <w:tab/>
             </w:r>
             <w:r>
               <w:rPr>
                 <w:noProof/>
+                <w:sz w:val="26"/>
+                <w:szCs w:val="26"/>
               </w:rPr>
               <w:fldChar w:fldCharType="begin"/>
             </w:r>
             <w:r>
               <w:rPr>
                 <w:noProof/>
+                <w:sz w:val="26"/>
+                <w:szCs w:val="26"/>
               </w:rPr>
               <w:instrText xml:space="preserve"> PAGEREF _Toc243990643 \h </w:instrText>
             </w:r>
             <w:r>
               <w:rPr>
                 <w:noProof/>
-              </w:rPr>
-            </w:r>
-            <w:r>
-              <w:rPr>
-                <w:noProof/>
+                <w:sz w:val="26"/>
+                <w:szCs w:val="26"/>
+              </w:rPr>
+            </w:r>
+            <w:r>
+              <w:rPr>
+                <w:noProof/>
+                <w:sz w:val="26"/>
+                <w:szCs w:val="26"/>
               </w:rPr>
               <w:fldChar w:fldCharType="separate"/>
             </w:r>
             <w:r>
               <w:rPr>
                 <w:noProof/>
+                <w:sz w:val="26"/>
+                <w:szCs w:val="26"/>
               </w:rPr>
               <w:t>3</w:t>
             </w:r>
             <w:r>
               <w:rPr>
                 <w:noProof/>
+                <w:sz w:val="26"/>
+                <w:szCs w:val="26"/>
               </w:rPr>
               <w:fldChar w:fldCharType="end"/>
             </w:r>
@@ -482,8 +588,8 @@
               <w:rFonts w:asciiTheme="minorHAnsi" w:eastAsiaTheme="minorEastAsia" w:hAnsiTheme="minorHAnsi" w:cstheme="minorBidi"/>
               <w:noProof/>
               <w:kern w:val="2"/>
-              <w:sz w:val="24"/>
-              <w:szCs w:val="24"/>
+              <w:sz w:val="26"/>
+              <w:szCs w:val="26"/>
               <w14:ligatures w14:val="standardContextual"/>
             </w:rPr>
           </w:pPr>
@@ -492,47 +598,63 @@
               <w:rPr>
                 <w:rStyle w:val="Hyperlink"/>
                 <w:noProof/>
+                <w:sz w:val="26"/>
+                <w:szCs w:val="26"/>
               </w:rPr>
               <w:t>2.2. Tạo file định dạng tùy chỉnh style.css</w:t>
             </w:r>
             <w:r>
               <w:rPr>
                 <w:noProof/>
+                <w:sz w:val="26"/>
+                <w:szCs w:val="26"/>
               </w:rPr>
               <w:tab/>
             </w:r>
             <w:r>
               <w:rPr>
                 <w:noProof/>
+                <w:sz w:val="26"/>
+                <w:szCs w:val="26"/>
               </w:rPr>
               <w:fldChar w:fldCharType="begin"/>
             </w:r>
             <w:r>
               <w:rPr>
                 <w:noProof/>
+                <w:sz w:val="26"/>
+                <w:szCs w:val="26"/>
               </w:rPr>
               <w:instrText xml:space="preserve"> PAGEREF _Toc243990644 \h </w:instrText>
             </w:r>
             <w:r>
               <w:rPr>
                 <w:noProof/>
-              </w:rPr>
-            </w:r>
-            <w:r>
-              <w:rPr>
-                <w:noProof/>
+                <w:sz w:val="26"/>
+                <w:szCs w:val="26"/>
+              </w:rPr>
+            </w:r>
+            <w:r>
+              <w:rPr>
+                <w:noProof/>
+                <w:sz w:val="26"/>
+                <w:szCs w:val="26"/>
               </w:rPr>
               <w:fldChar w:fldCharType="separate"/>
             </w:r>
             <w:r>
               <w:rPr>
                 <w:noProof/>
+                <w:sz w:val="26"/>
+                <w:szCs w:val="26"/>
               </w:rPr>
               <w:t>4</w:t>
             </w:r>
             <w:r>
               <w:rPr>
                 <w:noProof/>
+                <w:sz w:val="26"/>
+                <w:szCs w:val="26"/>
               </w:rPr>
               <w:fldChar w:fldCharType="end"/>
             </w:r>
@@ -548,8 +670,8 @@
               <w:rFonts w:asciiTheme="minorHAnsi" w:eastAsiaTheme="minorEastAsia" w:hAnsiTheme="minorHAnsi" w:cstheme="minorBidi"/>
               <w:noProof/>
               <w:kern w:val="2"/>
-              <w:sz w:val="24"/>
-              <w:szCs w:val="24"/>
+              <w:sz w:val="26"/>
+              <w:szCs w:val="26"/>
               <w14:ligatures w14:val="standardContextual"/>
             </w:rPr>
           </w:pPr>
@@ -558,47 +680,63 @@
               <w:rPr>
                 <w:rStyle w:val="Hyperlink"/>
                 <w:noProof/>
+                <w:sz w:val="26"/>
+                <w:szCs w:val="26"/>
               </w:rPr>
               <w:t>Bước 3. Chuẩn bị cơ sở dữ liệu SQL Server</w:t>
             </w:r>
             <w:r>
               <w:rPr>
                 <w:noProof/>
+                <w:sz w:val="26"/>
+                <w:szCs w:val="26"/>
               </w:rPr>
               <w:tab/>
             </w:r>
             <w:r>
               <w:rPr>
                 <w:noProof/>
+                <w:sz w:val="26"/>
+                <w:szCs w:val="26"/>
               </w:rPr>
               <w:fldChar w:fldCharType="begin"/>
             </w:r>
             <w:r>
               <w:rPr>
                 <w:noProof/>
+                <w:sz w:val="26"/>
+                <w:szCs w:val="26"/>
               </w:rPr>
               <w:instrText xml:space="preserve"> PAGEREF _Toc243990645 \h </w:instrText>
             </w:r>
             <w:r>
               <w:rPr>
                 <w:noProof/>
-              </w:rPr>
-            </w:r>
-            <w:r>
-              <w:rPr>
-                <w:noProof/>
+                <w:sz w:val="26"/>
+                <w:szCs w:val="26"/>
+              </w:rPr>
+            </w:r>
+            <w:r>
+              <w:rPr>
+                <w:noProof/>
+                <w:sz w:val="26"/>
+                <w:szCs w:val="26"/>
               </w:rPr>
               <w:fldChar w:fldCharType="separate"/>
             </w:r>
             <w:r>
               <w:rPr>
                 <w:noProof/>
+                <w:sz w:val="26"/>
+                <w:szCs w:val="26"/>
               </w:rPr>
               <w:t>4</w:t>
             </w:r>
             <w:r>
               <w:rPr>
                 <w:noProof/>
+                <w:sz w:val="26"/>
+                <w:szCs w:val="26"/>
               </w:rPr>
               <w:fldChar w:fldCharType="end"/>
             </w:r>
@@ -614,8 +752,8 @@
               <w:rFonts w:asciiTheme="minorHAnsi" w:eastAsiaTheme="minorEastAsia" w:hAnsiTheme="minorHAnsi" w:cstheme="minorBidi"/>
               <w:noProof/>
               <w:kern w:val="2"/>
-              <w:sz w:val="24"/>
-              <w:szCs w:val="24"/>
+              <w:sz w:val="26"/>
+              <w:szCs w:val="26"/>
               <w14:ligatures w14:val="standardContextual"/>
             </w:rPr>
           </w:pPr>
@@ -624,47 +762,63 @@
               <w:rPr>
                 <w:rStyle w:val="Hyperlink"/>
                 <w:noProof/>
+                <w:sz w:val="26"/>
+                <w:szCs w:val="26"/>
               </w:rPr>
               <w:t>Bước 4. Cấu hình kết nối &amp; Thông báo lỗi</w:t>
             </w:r>
             <w:r>
               <w:rPr>
                 <w:noProof/>
+                <w:sz w:val="26"/>
+                <w:szCs w:val="26"/>
               </w:rPr>
               <w:tab/>
             </w:r>
             <w:r>
               <w:rPr>
                 <w:noProof/>
+                <w:sz w:val="26"/>
+                <w:szCs w:val="26"/>
               </w:rPr>
               <w:fldChar w:fldCharType="begin"/>
             </w:r>
             <w:r>
               <w:rPr>
                 <w:noProof/>
+                <w:sz w:val="26"/>
+                <w:szCs w:val="26"/>
               </w:rPr>
               <w:instrText xml:space="preserve"> PAGEREF _Toc243990646 \h </w:instrText>
             </w:r>
             <w:r>
               <w:rPr>
                 <w:noProof/>
-              </w:rPr>
-            </w:r>
-            <w:r>
-              <w:rPr>
-                <w:noProof/>
+                <w:sz w:val="26"/>
+                <w:szCs w:val="26"/>
+              </w:rPr>
+            </w:r>
+            <w:r>
+              <w:rPr>
+                <w:noProof/>
+                <w:sz w:val="26"/>
+                <w:szCs w:val="26"/>
               </w:rPr>
               <w:fldChar w:fldCharType="separate"/>
             </w:r>
             <w:r>
               <w:rPr>
                 <w:noProof/>
+                <w:sz w:val="26"/>
+                <w:szCs w:val="26"/>
               </w:rPr>
               <w:t>5</w:t>
             </w:r>
             <w:r>
               <w:rPr>
                 <w:noProof/>
+                <w:sz w:val="26"/>
+                <w:szCs w:val="26"/>
               </w:rPr>
               <w:fldChar w:fldCharType="end"/>
             </w:r>
@@ -680,8 +834,8 @@
               <w:rFonts w:asciiTheme="minorHAnsi" w:eastAsiaTheme="minorEastAsia" w:hAnsiTheme="minorHAnsi" w:cstheme="minorBidi"/>
               <w:noProof/>
               <w:kern w:val="2"/>
-              <w:sz w:val="24"/>
-              <w:szCs w:val="24"/>
+              <w:sz w:val="26"/>
+              <w:szCs w:val="26"/>
               <w14:ligatures w14:val="standardContextual"/>
             </w:rPr>
           </w:pPr>
@@ -690,47 +844,63 @@
               <w:rPr>
                 <w:rStyle w:val="Hyperlink"/>
                 <w:noProof/>
+                <w:sz w:val="26"/>
+                <w:szCs w:val="26"/>
               </w:rPr>
               <w:t>4.1. Cấu hình file application.properties</w:t>
             </w:r>
             <w:r>
               <w:rPr>
                 <w:noProof/>
+                <w:sz w:val="26"/>
+                <w:szCs w:val="26"/>
               </w:rPr>
               <w:tab/>
             </w:r>
             <w:r>
               <w:rPr>
                 <w:noProof/>
+                <w:sz w:val="26"/>
+                <w:szCs w:val="26"/>
               </w:rPr>
               <w:fldChar w:fldCharType="begin"/>
             </w:r>
             <w:r>
               <w:rPr>
                 <w:noProof/>
+                <w:sz w:val="26"/>
+                <w:szCs w:val="26"/>
               </w:rPr>
               <w:instrText xml:space="preserve"> PAGEREF _Toc243990647 \h </w:instrText>
             </w:r>
             <w:r>
               <w:rPr>
                 <w:noProof/>
-              </w:rPr>
-            </w:r>
-            <w:r>
-              <w:rPr>
-                <w:noProof/>
+                <w:sz w:val="26"/>
+                <w:szCs w:val="26"/>
+              </w:rPr>
+            </w:r>
+            <w:r>
+              <w:rPr>
+                <w:noProof/>
+                <w:sz w:val="26"/>
+                <w:szCs w:val="26"/>
               </w:rPr>
               <w:fldChar w:fldCharType="separate"/>
             </w:r>
             <w:r>
               <w:rPr>
                 <w:noProof/>
+                <w:sz w:val="26"/>
+                <w:szCs w:val="26"/>
               </w:rPr>
               <w:t>5</w:t>
             </w:r>
             <w:r>
               <w:rPr>
                 <w:noProof/>
+                <w:sz w:val="26"/>
+                <w:szCs w:val="26"/>
               </w:rPr>
               <w:fldChar w:fldCharType="end"/>
             </w:r>
@@ -746,8 +916,8 @@
               <w:rFonts w:asciiTheme="minorHAnsi" w:eastAsiaTheme="minorEastAsia" w:hAnsiTheme="minorHAnsi" w:cstheme="minorBidi"/>
               <w:noProof/>
               <w:kern w:val="2"/>
-              <w:sz w:val="24"/>
-              <w:szCs w:val="24"/>
+              <w:sz w:val="26"/>
+              <w:szCs w:val="26"/>
               <w14:ligatures w14:val="standardContextual"/>
             </w:rPr>
           </w:pPr>
@@ -756,47 +926,63 @@
               <w:rPr>
                 <w:rStyle w:val="Hyperlink"/>
                 <w:noProof/>
+                <w:sz w:val="26"/>
+                <w:szCs w:val="26"/>
               </w:rPr>
               <w:t>4.2. Cấu hình thông báo lỗi tiếng Việt trong messages.properties</w:t>
             </w:r>
             <w:r>
               <w:rPr>
                 <w:noProof/>
+                <w:sz w:val="26"/>
+                <w:szCs w:val="26"/>
               </w:rPr>
               <w:tab/>
             </w:r>
             <w:r>
               <w:rPr>
                 <w:noProof/>
+                <w:sz w:val="26"/>
+                <w:szCs w:val="26"/>
               </w:rPr>
               <w:fldChar w:fldCharType="begin"/>
             </w:r>
             <w:r>
               <w:rPr>
                 <w:noProof/>
+                <w:sz w:val="26"/>
+                <w:szCs w:val="26"/>
               </w:rPr>
               <w:instrText xml:space="preserve"> PAGEREF _Toc243990648 \h </w:instrText>
             </w:r>
             <w:r>
               <w:rPr>
                 <w:noProof/>
-              </w:rPr>
-            </w:r>
-            <w:r>
-              <w:rPr>
-                <w:noProof/>
+                <w:sz w:val="26"/>
+                <w:szCs w:val="26"/>
+              </w:rPr>
+            </w:r>
+            <w:r>
+              <w:rPr>
+                <w:noProof/>
+                <w:sz w:val="26"/>
+                <w:szCs w:val="26"/>
               </w:rPr>
               <w:fldChar w:fldCharType="separate"/>
             </w:r>
             <w:r>
               <w:rPr>
                 <w:noProof/>
+                <w:sz w:val="26"/>
+                <w:szCs w:val="26"/>
               </w:rPr>
               <w:t>5</w:t>
             </w:r>
             <w:r>
               <w:rPr>
                 <w:noProof/>
+                <w:sz w:val="26"/>
+                <w:szCs w:val="26"/>
               </w:rPr>
               <w:fldChar w:fldCharType="end"/>
             </w:r>
@@ -812,8 +998,8 @@
               <w:rFonts w:asciiTheme="minorHAnsi" w:eastAsiaTheme="minorEastAsia" w:hAnsiTheme="minorHAnsi" w:cstheme="minorBidi"/>
               <w:noProof/>
               <w:kern w:val="2"/>
-              <w:sz w:val="24"/>
-              <w:szCs w:val="24"/>
+              <w:sz w:val="26"/>
+              <w:szCs w:val="26"/>
               <w14:ligatures w14:val="standardContextual"/>
             </w:rPr>
           </w:pPr>
@@ -822,47 +1008,63 @@
               <w:rPr>
                 <w:rStyle w:val="Hyperlink"/>
                 <w:noProof/>
+                <w:sz w:val="26"/>
+                <w:szCs w:val="26"/>
               </w:rPr>
               <w:t>Bước 5. Xây dựng Entity Student &amp; Validation</w:t>
             </w:r>
             <w:r>
               <w:rPr>
                 <w:noProof/>
+                <w:sz w:val="26"/>
+                <w:szCs w:val="26"/>
               </w:rPr>
               <w:tab/>
             </w:r>
             <w:r>
               <w:rPr>
                 <w:noProof/>
+                <w:sz w:val="26"/>
+                <w:szCs w:val="26"/>
               </w:rPr>
               <w:fldChar w:fldCharType="begin"/>
             </w:r>
             <w:r>
               <w:rPr>
                 <w:noProof/>
+                <w:sz w:val="26"/>
+                <w:szCs w:val="26"/>
               </w:rPr>
               <w:instrText xml:space="preserve"> PAGEREF _Toc243990649 \h </w:instrText>
             </w:r>
             <w:r>
               <w:rPr>
                 <w:noProof/>
-              </w:rPr>
-            </w:r>
-            <w:r>
-              <w:rPr>
-                <w:noProof/>
+                <w:sz w:val="26"/>
+                <w:szCs w:val="26"/>
+              </w:rPr>
+            </w:r>
+            <w:r>
+              <w:rPr>
+                <w:noProof/>
+                <w:sz w:val="26"/>
+                <w:szCs w:val="26"/>
               </w:rPr>
               <w:fldChar w:fldCharType="separate"/>
             </w:r>
             <w:r>
               <w:rPr>
                 <w:noProof/>
+                <w:sz w:val="26"/>
+                <w:szCs w:val="26"/>
               </w:rPr>
               <w:t>6</w:t>
             </w:r>
             <w:r>
               <w:rPr>
                 <w:noProof/>
+                <w:sz w:val="26"/>
+                <w:szCs w:val="26"/>
               </w:rPr>
               <w:fldChar w:fldCharType="end"/>
             </w:r>
@@ -878,8 +1080,8 @@
               <w:rFonts w:asciiTheme="minorHAnsi" w:eastAsiaTheme="minorEastAsia" w:hAnsiTheme="minorHAnsi" w:cstheme="minorBidi"/>
               <w:noProof/>
               <w:kern w:val="2"/>
-              <w:sz w:val="24"/>
-              <w:szCs w:val="24"/>
+              <w:sz w:val="26"/>
+              <w:szCs w:val="26"/>
               <w14:ligatures w14:val="standardContextual"/>
             </w:rPr>
           </w:pPr>
@@ -888,47 +1090,63 @@
               <w:rPr>
                 <w:rStyle w:val="Hyperlink"/>
                 <w:noProof/>
+                <w:sz w:val="26"/>
+                <w:szCs w:val="26"/>
               </w:rPr>
               <w:t>5.1. Ánh xạ JPA &amp; Ràng buộc Bean Validation</w:t>
             </w:r>
             <w:r>
               <w:rPr>
                 <w:noProof/>
+                <w:sz w:val="26"/>
+                <w:szCs w:val="26"/>
               </w:rPr>
               <w:tab/>
             </w:r>
             <w:r>
               <w:rPr>
                 <w:noProof/>
+                <w:sz w:val="26"/>
+                <w:szCs w:val="26"/>
               </w:rPr>
               <w:fldChar w:fldCharType="begin"/>
             </w:r>
             <w:r>
               <w:rPr>
                 <w:noProof/>
+                <w:sz w:val="26"/>
+                <w:szCs w:val="26"/>
               </w:rPr>
               <w:instrText xml:space="preserve"> PAGEREF _Toc243990650 \h </w:instrText>
             </w:r>
             <w:r>
               <w:rPr>
                 <w:noProof/>
-              </w:rPr>
-            </w:r>
-            <w:r>
-              <w:rPr>
-                <w:noProof/>
+                <w:sz w:val="26"/>
+                <w:szCs w:val="26"/>
+              </w:rPr>
+            </w:r>
+            <w:r>
+              <w:rPr>
+                <w:noProof/>
+                <w:sz w:val="26"/>
+                <w:szCs w:val="26"/>
               </w:rPr>
               <w:fldChar w:fldCharType="separate"/>
             </w:r>
             <w:r>
               <w:rPr>
                 <w:noProof/>
+                <w:sz w:val="26"/>
+                <w:szCs w:val="26"/>
               </w:rPr>
               <w:t>6</w:t>
             </w:r>
             <w:r>
               <w:rPr>
                 <w:noProof/>
+                <w:sz w:val="26"/>
+                <w:szCs w:val="26"/>
               </w:rPr>
               <w:fldChar w:fldCharType="end"/>
             </w:r>
@@ -944,8 +1162,8 @@
               <w:rFonts w:asciiTheme="minorHAnsi" w:eastAsiaTheme="minorEastAsia" w:hAnsiTheme="minorHAnsi" w:cstheme="minorBidi"/>
               <w:noProof/>
               <w:kern w:val="2"/>
-              <w:sz w:val="24"/>
-              <w:szCs w:val="24"/>
+              <w:sz w:val="26"/>
+              <w:szCs w:val="26"/>
               <w14:ligatures w14:val="standardContextual"/>
             </w:rPr>
           </w:pPr>
@@ -954,47 +1172,63 @@
               <w:rPr>
                 <w:rStyle w:val="Hyperlink"/>
                 <w:noProof/>
+                <w:sz w:val="26"/>
+                <w:szCs w:val="26"/>
               </w:rPr>
               <w:t>5.2. Thuộc tính tính toán &amp; Getter/Setter</w:t>
             </w:r>
             <w:r>
               <w:rPr>
                 <w:noProof/>
+                <w:sz w:val="26"/>
+                <w:szCs w:val="26"/>
               </w:rPr>
               <w:tab/>
             </w:r>
             <w:r>
               <w:rPr>
                 <w:noProof/>
+                <w:sz w:val="26"/>
+                <w:szCs w:val="26"/>
               </w:rPr>
               <w:fldChar w:fldCharType="begin"/>
             </w:r>
             <w:r>
               <w:rPr>
                 <w:noProof/>
+                <w:sz w:val="26"/>
+                <w:szCs w:val="26"/>
               </w:rPr>
               <w:instrText xml:space="preserve"> PAGEREF _Toc243990651 \h </w:instrText>
             </w:r>
             <w:r>
               <w:rPr>
                 <w:noProof/>
-              </w:rPr>
-            </w:r>
-            <w:r>
-              <w:rPr>
-                <w:noProof/>
+                <w:sz w:val="26"/>
+                <w:szCs w:val="26"/>
+              </w:rPr>
+            </w:r>
+            <w:r>
+              <w:rPr>
+                <w:noProof/>
+                <w:sz w:val="26"/>
+                <w:szCs w:val="26"/>
               </w:rPr>
               <w:fldChar w:fldCharType="separate"/>
             </w:r>
             <w:r>
               <w:rPr>
                 <w:noProof/>
+                <w:sz w:val="26"/>
+                <w:szCs w:val="26"/>
               </w:rPr>
               <w:t>6</w:t>
             </w:r>
             <w:r>
               <w:rPr>
                 <w:noProof/>
+                <w:sz w:val="26"/>
+                <w:szCs w:val="26"/>
               </w:rPr>
               <w:fldChar w:fldCharType="end"/>
             </w:r>
@@ -1010,8 +1244,8 @@
               <w:rFonts w:asciiTheme="minorHAnsi" w:eastAsiaTheme="minorEastAsia" w:hAnsiTheme="minorHAnsi" w:cstheme="minorBidi"/>
               <w:noProof/>
               <w:kern w:val="2"/>
-              <w:sz w:val="24"/>
-              <w:szCs w:val="24"/>
+              <w:sz w:val="26"/>
+              <w:szCs w:val="26"/>
               <w14:ligatures w14:val="standardContextual"/>
             </w:rPr>
           </w:pPr>
@@ -1020,47 +1254,63 @@
               <w:rPr>
                 <w:rStyle w:val="Hyperlink"/>
                 <w:noProof/>
+                <w:sz w:val="26"/>
+                <w:szCs w:val="26"/>
               </w:rPr>
               <w:t>Bước 6. Xây dựng Repository</w:t>
             </w:r>
             <w:r>
               <w:rPr>
                 <w:noProof/>
+                <w:sz w:val="26"/>
+                <w:szCs w:val="26"/>
               </w:rPr>
               <w:tab/>
             </w:r>
             <w:r>
               <w:rPr>
                 <w:noProof/>
+                <w:sz w:val="26"/>
+                <w:szCs w:val="26"/>
               </w:rPr>
               <w:fldChar w:fldCharType="begin"/>
             </w:r>
             <w:r>
               <w:rPr>
                 <w:noProof/>
+                <w:sz w:val="26"/>
+                <w:szCs w:val="26"/>
               </w:rPr>
               <w:instrText xml:space="preserve"> PAGEREF _Toc243990652 \h </w:instrText>
             </w:r>
             <w:r>
               <w:rPr>
                 <w:noProof/>
-              </w:rPr>
-            </w:r>
-            <w:r>
-              <w:rPr>
-                <w:noProof/>
+                <w:sz w:val="26"/>
+                <w:szCs w:val="26"/>
+              </w:rPr>
+            </w:r>
+            <w:r>
+              <w:rPr>
+                <w:noProof/>
+                <w:sz w:val="26"/>
+                <w:szCs w:val="26"/>
               </w:rPr>
               <w:fldChar w:fldCharType="separate"/>
             </w:r>
             <w:r>
               <w:rPr>
                 <w:noProof/>
+                <w:sz w:val="26"/>
+                <w:szCs w:val="26"/>
               </w:rPr>
               <w:t>7</w:t>
             </w:r>
             <w:r>
               <w:rPr>
                 <w:noProof/>
+                <w:sz w:val="26"/>
+                <w:szCs w:val="26"/>
               </w:rPr>
               <w:fldChar w:fldCharType="end"/>
             </w:r>
@@ -1076,8 +1326,8 @@
               <w:rFonts w:asciiTheme="minorHAnsi" w:eastAsiaTheme="minorEastAsia" w:hAnsiTheme="minorHAnsi" w:cstheme="minorBidi"/>
               <w:noProof/>
               <w:kern w:val="2"/>
-              <w:sz w:val="24"/>
-              <w:szCs w:val="24"/>
+              <w:sz w:val="26"/>
+              <w:szCs w:val="26"/>
               <w14:ligatures w14:val="standardContextual"/>
             </w:rPr>
           </w:pPr>
@@ -1086,47 +1336,63 @@
               <w:rPr>
                 <w:rStyle w:val="Hyperlink"/>
                 <w:noProof/>
+                <w:sz w:val="26"/>
+                <w:szCs w:val="26"/>
               </w:rPr>
               <w:t>6.1. Khai báo interface StudentRepository</w:t>
             </w:r>
             <w:r>
               <w:rPr>
                 <w:noProof/>
+                <w:sz w:val="26"/>
+                <w:szCs w:val="26"/>
               </w:rPr>
               <w:tab/>
             </w:r>
             <w:r>
               <w:rPr>
                 <w:noProof/>
+                <w:sz w:val="26"/>
+                <w:szCs w:val="26"/>
               </w:rPr>
               <w:fldChar w:fldCharType="begin"/>
             </w:r>
             <w:r>
               <w:rPr>
                 <w:noProof/>
+                <w:sz w:val="26"/>
+                <w:szCs w:val="26"/>
               </w:rPr>
               <w:instrText xml:space="preserve"> PAGEREF _Toc243990653 \h </w:instrText>
             </w:r>
             <w:r>
               <w:rPr>
                 <w:noProof/>
-              </w:rPr>
-            </w:r>
-            <w:r>
-              <w:rPr>
-                <w:noProof/>
+                <w:sz w:val="26"/>
+                <w:szCs w:val="26"/>
+              </w:rPr>
+            </w:r>
+            <w:r>
+              <w:rPr>
+                <w:noProof/>
+                <w:sz w:val="26"/>
+                <w:szCs w:val="26"/>
               </w:rPr>
               <w:fldChar w:fldCharType="separate"/>
             </w:r>
             <w:r>
               <w:rPr>
                 <w:noProof/>
+                <w:sz w:val="26"/>
+                <w:szCs w:val="26"/>
               </w:rPr>
               <w:t>7</w:t>
             </w:r>
             <w:r>
               <w:rPr>
                 <w:noProof/>
+                <w:sz w:val="26"/>
+                <w:szCs w:val="26"/>
               </w:rPr>
               <w:fldChar w:fldCharType="end"/>
             </w:r>
@@ -1142,8 +1408,8 @@
               <w:rFonts w:asciiTheme="minorHAnsi" w:eastAsiaTheme="minorEastAsia" w:hAnsiTheme="minorHAnsi" w:cstheme="minorBidi"/>
               <w:noProof/>
               <w:kern w:val="2"/>
-              <w:sz w:val="24"/>
-              <w:szCs w:val="24"/>
+              <w:sz w:val="26"/>
+              <w:szCs w:val="26"/>
               <w14:ligatures w14:val="standardContextual"/>
             </w:rPr>
           </w:pPr>
@@ -1152,47 +1418,63 @@
               <w:rPr>
                 <w:rStyle w:val="Hyperlink"/>
                 <w:noProof/>
+                <w:sz w:val="26"/>
+                <w:szCs w:val="26"/>
               </w:rPr>
               <w:t>6.2. Kiểm thử Repository</w:t>
             </w:r>
             <w:r>
               <w:rPr>
                 <w:noProof/>
+                <w:sz w:val="26"/>
+                <w:szCs w:val="26"/>
               </w:rPr>
               <w:tab/>
             </w:r>
             <w:r>
               <w:rPr>
                 <w:noProof/>
+                <w:sz w:val="26"/>
+                <w:szCs w:val="26"/>
               </w:rPr>
               <w:fldChar w:fldCharType="begin"/>
             </w:r>
             <w:r>
               <w:rPr>
                 <w:noProof/>
+                <w:sz w:val="26"/>
+                <w:szCs w:val="26"/>
               </w:rPr>
               <w:instrText xml:space="preserve"> PAGEREF _Toc243990654 \h </w:instrText>
             </w:r>
             <w:r>
               <w:rPr>
                 <w:noProof/>
-              </w:rPr>
-            </w:r>
-            <w:r>
-              <w:rPr>
-                <w:noProof/>
+                <w:sz w:val="26"/>
+                <w:szCs w:val="26"/>
+              </w:rPr>
+            </w:r>
+            <w:r>
+              <w:rPr>
+                <w:noProof/>
+                <w:sz w:val="26"/>
+                <w:szCs w:val="26"/>
               </w:rPr>
               <w:fldChar w:fldCharType="separate"/>
             </w:r>
             <w:r>
               <w:rPr>
                 <w:noProof/>
+                <w:sz w:val="26"/>
+                <w:szCs w:val="26"/>
               </w:rPr>
               <w:t>8</w:t>
             </w:r>
             <w:r>
               <w:rPr>
                 <w:noProof/>
+                <w:sz w:val="26"/>
+                <w:szCs w:val="26"/>
               </w:rPr>
               <w:fldChar w:fldCharType="end"/>
             </w:r>
@@ -1208,8 +1490,8 @@
               <w:rFonts w:asciiTheme="minorHAnsi" w:eastAsiaTheme="minorEastAsia" w:hAnsiTheme="minorHAnsi" w:cstheme="minorBidi"/>
               <w:noProof/>
               <w:kern w:val="2"/>
-              <w:sz w:val="24"/>
-              <w:szCs w:val="24"/>
+              <w:sz w:val="26"/>
+              <w:szCs w:val="26"/>
               <w14:ligatures w14:val="standardContextual"/>
             </w:rPr>
           </w:pPr>
@@ -1218,47 +1500,63 @@
               <w:rPr>
                 <w:rStyle w:val="Hyperlink"/>
                 <w:noProof/>
+                <w:sz w:val="26"/>
+                <w:szCs w:val="26"/>
               </w:rPr>
               <w:t>Bước 7. Tầng Dịch vụ &amp; Khởi tạo dữ liệu mẫu</w:t>
             </w:r>
             <w:r>
               <w:rPr>
                 <w:noProof/>
+                <w:sz w:val="26"/>
+                <w:szCs w:val="26"/>
               </w:rPr>
               <w:tab/>
             </w:r>
             <w:r>
               <w:rPr>
                 <w:noProof/>
+                <w:sz w:val="26"/>
+                <w:szCs w:val="26"/>
               </w:rPr>
               <w:fldChar w:fldCharType="begin"/>
             </w:r>
             <w:r>
               <w:rPr>
                 <w:noProof/>
+                <w:sz w:val="26"/>
+                <w:szCs w:val="26"/>
               </w:rPr>
               <w:instrText xml:space="preserve"> PAGEREF _Toc243990655 \h </w:instrText>
             </w:r>
             <w:r>
               <w:rPr>
                 <w:noProof/>
-              </w:rPr>
-            </w:r>
-            <w:r>
-              <w:rPr>
-                <w:noProof/>
+                <w:sz w:val="26"/>
+                <w:szCs w:val="26"/>
+              </w:rPr>
+            </w:r>
+            <w:r>
+              <w:rPr>
+                <w:noProof/>
+                <w:sz w:val="26"/>
+                <w:szCs w:val="26"/>
               </w:rPr>
               <w:fldChar w:fldCharType="separate"/>
             </w:r>
             <w:r>
               <w:rPr>
                 <w:noProof/>
+                <w:sz w:val="26"/>
+                <w:szCs w:val="26"/>
               </w:rPr>
               <w:t>8</w:t>
             </w:r>
             <w:r>
               <w:rPr>
                 <w:noProof/>
+                <w:sz w:val="26"/>
+                <w:szCs w:val="26"/>
               </w:rPr>
               <w:fldChar w:fldCharType="end"/>
             </w:r>
@@ -1274,8 +1572,8 @@
               <w:rFonts w:asciiTheme="minorHAnsi" w:eastAsiaTheme="minorEastAsia" w:hAnsiTheme="minorHAnsi" w:cstheme="minorBidi"/>
               <w:noProof/>
               <w:kern w:val="2"/>
-              <w:sz w:val="24"/>
-              <w:szCs w:val="24"/>
+              <w:sz w:val="26"/>
+              <w:szCs w:val="26"/>
               <w14:ligatures w14:val="standardContextual"/>
             </w:rPr>
           </w:pPr>
@@ -1284,47 +1582,63 @@
               <w:rPr>
                 <w:rStyle w:val="Hyperlink"/>
                 <w:noProof/>
+                <w:sz w:val="26"/>
+                <w:szCs w:val="26"/>
               </w:rPr>
               <w:t>7.1. Cài đặt StudentService.java</w:t>
             </w:r>
             <w:r>
               <w:rPr>
                 <w:noProof/>
+                <w:sz w:val="26"/>
+                <w:szCs w:val="26"/>
               </w:rPr>
               <w:tab/>
             </w:r>
             <w:r>
               <w:rPr>
                 <w:noProof/>
+                <w:sz w:val="26"/>
+                <w:szCs w:val="26"/>
               </w:rPr>
               <w:fldChar w:fldCharType="begin"/>
             </w:r>
             <w:r>
               <w:rPr>
                 <w:noProof/>
+                <w:sz w:val="26"/>
+                <w:szCs w:val="26"/>
               </w:rPr>
               <w:instrText xml:space="preserve"> PAGEREF _Toc243990656 \h </w:instrText>
             </w:r>
             <w:r>
               <w:rPr>
                 <w:noProof/>
-              </w:rPr>
-            </w:r>
-            <w:r>
-              <w:rPr>
-                <w:noProof/>
+                <w:sz w:val="26"/>
+                <w:szCs w:val="26"/>
+              </w:rPr>
+            </w:r>
+            <w:r>
+              <w:rPr>
+                <w:noProof/>
+                <w:sz w:val="26"/>
+                <w:szCs w:val="26"/>
               </w:rPr>
               <w:fldChar w:fldCharType="separate"/>
             </w:r>
             <w:r>
               <w:rPr>
                 <w:noProof/>
+                <w:sz w:val="26"/>
+                <w:szCs w:val="26"/>
               </w:rPr>
               <w:t>8</w:t>
             </w:r>
             <w:r>
               <w:rPr>
                 <w:noProof/>
+                <w:sz w:val="26"/>
+                <w:szCs w:val="26"/>
               </w:rPr>
               <w:fldChar w:fldCharType="end"/>
             </w:r>
@@ -1340,8 +1654,8 @@
               <w:rFonts w:asciiTheme="minorHAnsi" w:eastAsiaTheme="minorEastAsia" w:hAnsiTheme="minorHAnsi" w:cstheme="minorBidi"/>
               <w:noProof/>
               <w:kern w:val="2"/>
-              <w:sz w:val="24"/>
-              <w:szCs w:val="24"/>
+              <w:sz w:val="26"/>
+              <w:szCs w:val="26"/>
               <w14:ligatures w14:val="standardContextual"/>
             </w:rPr>
           </w:pPr>
@@ -1350,47 +1664,63 @@
               <w:rPr>
                 <w:rStyle w:val="Hyperlink"/>
                 <w:noProof/>
+                <w:sz w:val="26"/>
+                <w:szCs w:val="26"/>
               </w:rPr>
               <w:t>7.2. Khởi tạo dữ liệu mẫu với DataInitializer.java</w:t>
             </w:r>
             <w:r>
               <w:rPr>
                 <w:noProof/>
+                <w:sz w:val="26"/>
+                <w:szCs w:val="26"/>
               </w:rPr>
               <w:tab/>
             </w:r>
             <w:r>
               <w:rPr>
                 <w:noProof/>
+                <w:sz w:val="26"/>
+                <w:szCs w:val="26"/>
               </w:rPr>
               <w:fldChar w:fldCharType="begin"/>
             </w:r>
             <w:r>
               <w:rPr>
                 <w:noProof/>
+                <w:sz w:val="26"/>
+                <w:szCs w:val="26"/>
               </w:rPr>
               <w:instrText xml:space="preserve"> PAGEREF _Toc243990657 \h </w:instrText>
             </w:r>
             <w:r>
               <w:rPr>
                 <w:noProof/>
-              </w:rPr>
-            </w:r>
-            <w:r>
-              <w:rPr>
-                <w:noProof/>
+                <w:sz w:val="26"/>
+                <w:szCs w:val="26"/>
+              </w:rPr>
+            </w:r>
+            <w:r>
+              <w:rPr>
+                <w:noProof/>
+                <w:sz w:val="26"/>
+                <w:szCs w:val="26"/>
               </w:rPr>
               <w:fldChar w:fldCharType="separate"/>
             </w:r>
             <w:r>
               <w:rPr>
                 <w:noProof/>
+                <w:sz w:val="26"/>
+                <w:szCs w:val="26"/>
               </w:rPr>
               <w:t>8</w:t>
             </w:r>
             <w:r>
               <w:rPr>
                 <w:noProof/>
+                <w:sz w:val="26"/>
+                <w:szCs w:val="26"/>
               </w:rPr>
               <w:fldChar w:fldCharType="end"/>
             </w:r>
@@ -1406,8 +1736,8 @@
               <w:rFonts w:asciiTheme="minorHAnsi" w:eastAsiaTheme="minorEastAsia" w:hAnsiTheme="minorHAnsi" w:cstheme="minorBidi"/>
               <w:noProof/>
               <w:kern w:val="2"/>
-              <w:sz w:val="24"/>
-              <w:szCs w:val="24"/>
+              <w:sz w:val="26"/>
+              <w:szCs w:val="26"/>
               <w14:ligatures w14:val="standardContextual"/>
             </w:rPr>
           </w:pPr>
@@ -1416,47 +1746,63 @@
               <w:rPr>
                 <w:rStyle w:val="Hyperlink"/>
                 <w:noProof/>
+                <w:sz w:val="26"/>
+                <w:szCs w:val="26"/>
               </w:rPr>
               <w:t>7.3. Dữ liệu mẫu trong SQL Server</w:t>
             </w:r>
             <w:r>
               <w:rPr>
                 <w:noProof/>
+                <w:sz w:val="26"/>
+                <w:szCs w:val="26"/>
               </w:rPr>
               <w:tab/>
             </w:r>
             <w:r>
               <w:rPr>
                 <w:noProof/>
+                <w:sz w:val="26"/>
+                <w:szCs w:val="26"/>
               </w:rPr>
               <w:fldChar w:fldCharType="begin"/>
             </w:r>
             <w:r>
               <w:rPr>
                 <w:noProof/>
+                <w:sz w:val="26"/>
+                <w:szCs w:val="26"/>
               </w:rPr>
               <w:instrText xml:space="preserve"> PAGEREF _Toc243990658 \h </w:instrText>
             </w:r>
             <w:r>
               <w:rPr>
                 <w:noProof/>
-              </w:rPr>
-            </w:r>
-            <w:r>
-              <w:rPr>
-                <w:noProof/>
+                <w:sz w:val="26"/>
+                <w:szCs w:val="26"/>
+              </w:rPr>
+            </w:r>
+            <w:r>
+              <w:rPr>
+                <w:noProof/>
+                <w:sz w:val="26"/>
+                <w:szCs w:val="26"/>
               </w:rPr>
               <w:fldChar w:fldCharType="separate"/>
             </w:r>
             <w:r>
               <w:rPr>
                 <w:noProof/>
+                <w:sz w:val="26"/>
+                <w:szCs w:val="26"/>
               </w:rPr>
               <w:t>9</w:t>
             </w:r>
             <w:r>
               <w:rPr>
                 <w:noProof/>
+                <w:sz w:val="26"/>
+                <w:szCs w:val="26"/>
               </w:rPr>
               <w:fldChar w:fldCharType="end"/>
             </w:r>
@@ -1472,8 +1818,8 @@
               <w:rFonts w:asciiTheme="minorHAnsi" w:eastAsiaTheme="minorEastAsia" w:hAnsiTheme="minorHAnsi" w:cstheme="minorBidi"/>
               <w:noProof/>
               <w:kern w:val="2"/>
-              <w:sz w:val="24"/>
-              <w:szCs w:val="24"/>
+              <w:sz w:val="26"/>
+              <w:szCs w:val="26"/>
               <w14:ligatures w14:val="standardContextual"/>
             </w:rPr>
           </w:pPr>
@@ -1482,47 +1828,63 @@
               <w:rPr>
                 <w:rStyle w:val="Hyperlink"/>
                 <w:noProof/>
+                <w:sz w:val="26"/>
+                <w:szCs w:val="26"/>
               </w:rPr>
               <w:t>Bước 8. Xây dựng Tầng Điều khiển (Controllers)</w:t>
             </w:r>
             <w:r>
               <w:rPr>
                 <w:noProof/>
+                <w:sz w:val="26"/>
+                <w:szCs w:val="26"/>
               </w:rPr>
               <w:tab/>
             </w:r>
             <w:r>
               <w:rPr>
                 <w:noProof/>
+                <w:sz w:val="26"/>
+                <w:szCs w:val="26"/>
               </w:rPr>
               <w:fldChar w:fldCharType="begin"/>
             </w:r>
             <w:r>
               <w:rPr>
                 <w:noProof/>
+                <w:sz w:val="26"/>
+                <w:szCs w:val="26"/>
               </w:rPr>
               <w:instrText xml:space="preserve"> PAGEREF _Toc243990659 \h </w:instrText>
             </w:r>
             <w:r>
               <w:rPr>
                 <w:noProof/>
-              </w:rPr>
-            </w:r>
-            <w:r>
-              <w:rPr>
-                <w:noProof/>
+                <w:sz w:val="26"/>
+                <w:szCs w:val="26"/>
+              </w:rPr>
+            </w:r>
+            <w:r>
+              <w:rPr>
+                <w:noProof/>
+                <w:sz w:val="26"/>
+                <w:szCs w:val="26"/>
               </w:rPr>
               <w:fldChar w:fldCharType="separate"/>
             </w:r>
             <w:r>
               <w:rPr>
                 <w:noProof/>
+                <w:sz w:val="26"/>
+                <w:szCs w:val="26"/>
               </w:rPr>
               <w:t>9</w:t>
             </w:r>
             <w:r>
               <w:rPr>
                 <w:noProof/>
+                <w:sz w:val="26"/>
+                <w:szCs w:val="26"/>
               </w:rPr>
               <w:fldChar w:fldCharType="end"/>
             </w:r>
@@ -1538,8 +1900,8 @@
               <w:rFonts w:asciiTheme="minorHAnsi" w:eastAsiaTheme="minorEastAsia" w:hAnsiTheme="minorHAnsi" w:cstheme="minorBidi"/>
               <w:noProof/>
               <w:kern w:val="2"/>
-              <w:sz w:val="24"/>
-              <w:szCs w:val="24"/>
+              <w:sz w:val="26"/>
+              <w:szCs w:val="26"/>
               <w14:ligatures w14:val="standardContextual"/>
             </w:rPr>
           </w:pPr>
@@ -1548,47 +1910,63 @@
               <w:rPr>
                 <w:rStyle w:val="Hyperlink"/>
                 <w:noProof/>
+                <w:sz w:val="26"/>
+                <w:szCs w:val="26"/>
               </w:rPr>
               <w:t>8.1. Điều hướng trang chủ HomeController.java</w:t>
             </w:r>
             <w:r>
               <w:rPr>
                 <w:noProof/>
+                <w:sz w:val="26"/>
+                <w:szCs w:val="26"/>
               </w:rPr>
               <w:tab/>
             </w:r>
             <w:r>
               <w:rPr>
                 <w:noProof/>
+                <w:sz w:val="26"/>
+                <w:szCs w:val="26"/>
               </w:rPr>
               <w:fldChar w:fldCharType="begin"/>
             </w:r>
             <w:r>
               <w:rPr>
                 <w:noProof/>
+                <w:sz w:val="26"/>
+                <w:szCs w:val="26"/>
               </w:rPr>
               <w:instrText xml:space="preserve"> PAGEREF _Toc243990660 \h </w:instrText>
             </w:r>
             <w:r>
               <w:rPr>
                 <w:noProof/>
-              </w:rPr>
-            </w:r>
-            <w:r>
-              <w:rPr>
-                <w:noProof/>
+                <w:sz w:val="26"/>
+                <w:szCs w:val="26"/>
+              </w:rPr>
+            </w:r>
+            <w:r>
+              <w:rPr>
+                <w:noProof/>
+                <w:sz w:val="26"/>
+                <w:szCs w:val="26"/>
               </w:rPr>
               <w:fldChar w:fldCharType="separate"/>
             </w:r>
             <w:r>
               <w:rPr>
                 <w:noProof/>
+                <w:sz w:val="26"/>
+                <w:szCs w:val="26"/>
               </w:rPr>
               <w:t>9</w:t>
             </w:r>
             <w:r>
               <w:rPr>
                 <w:noProof/>
+                <w:sz w:val="26"/>
+                <w:szCs w:val="26"/>
               </w:rPr>
               <w:fldChar w:fldCharType="end"/>
             </w:r>
@@ -1604,8 +1982,8 @@
               <w:rFonts w:asciiTheme="minorHAnsi" w:eastAsiaTheme="minorEastAsia" w:hAnsiTheme="minorHAnsi" w:cstheme="minorBidi"/>
               <w:noProof/>
               <w:kern w:val="2"/>
-              <w:sz w:val="24"/>
-              <w:szCs w:val="24"/>
+              <w:sz w:val="26"/>
+              <w:szCs w:val="26"/>
               <w14:ligatures w14:val="standardContextual"/>
             </w:rPr>
           </w:pPr>
@@ -1614,47 +1992,63 @@
               <w:rPr>
                 <w:rStyle w:val="Hyperlink"/>
                 <w:noProof/>
+                <w:sz w:val="26"/>
+                <w:szCs w:val="26"/>
               </w:rPr>
               <w:t>8.2. Các phương thức GET trong StudentController.java</w:t>
             </w:r>
             <w:r>
               <w:rPr>
                 <w:noProof/>
+                <w:sz w:val="26"/>
+                <w:szCs w:val="26"/>
               </w:rPr>
               <w:tab/>
             </w:r>
             <w:r>
               <w:rPr>
                 <w:noProof/>
+                <w:sz w:val="26"/>
+                <w:szCs w:val="26"/>
               </w:rPr>
               <w:fldChar w:fldCharType="begin"/>
             </w:r>
             <w:r>
               <w:rPr>
                 <w:noProof/>
+                <w:sz w:val="26"/>
+                <w:szCs w:val="26"/>
               </w:rPr>
               <w:instrText xml:space="preserve"> PAGEREF _Toc243990661 \h </w:instrText>
             </w:r>
             <w:r>
               <w:rPr>
                 <w:noProof/>
-              </w:rPr>
-            </w:r>
-            <w:r>
-              <w:rPr>
-                <w:noProof/>
+                <w:sz w:val="26"/>
+                <w:szCs w:val="26"/>
+              </w:rPr>
+            </w:r>
+            <w:r>
+              <w:rPr>
+                <w:noProof/>
+                <w:sz w:val="26"/>
+                <w:szCs w:val="26"/>
               </w:rPr>
               <w:fldChar w:fldCharType="separate"/>
             </w:r>
             <w:r>
               <w:rPr>
                 <w:noProof/>
+                <w:sz w:val="26"/>
+                <w:szCs w:val="26"/>
               </w:rPr>
               <w:t>10</w:t>
             </w:r>
             <w:r>
               <w:rPr>
                 <w:noProof/>
+                <w:sz w:val="26"/>
+                <w:szCs w:val="26"/>
               </w:rPr>
               <w:fldChar w:fldCharType="end"/>
             </w:r>
@@ -1670,8 +2064,8 @@
               <w:rFonts w:asciiTheme="minorHAnsi" w:eastAsiaTheme="minorEastAsia" w:hAnsiTheme="minorHAnsi" w:cstheme="minorBidi"/>
               <w:noProof/>
               <w:kern w:val="2"/>
-              <w:sz w:val="24"/>
-              <w:szCs w:val="24"/>
+              <w:sz w:val="26"/>
+              <w:szCs w:val="26"/>
               <w14:ligatures w14:val="standardContextual"/>
             </w:rPr>
           </w:pPr>
@@ -1680,47 +2074,63 @@
               <w:rPr>
                 <w:rStyle w:val="Hyperlink"/>
                 <w:noProof/>
+                <w:sz w:val="26"/>
+                <w:szCs w:val="26"/>
               </w:rPr>
               <w:t>8.3. Các phương thức GET form &amp; POST trong StudentController.java</w:t>
             </w:r>
             <w:r>
               <w:rPr>
                 <w:noProof/>
+                <w:sz w:val="26"/>
+                <w:szCs w:val="26"/>
               </w:rPr>
               <w:tab/>
             </w:r>
             <w:r>
               <w:rPr>
                 <w:noProof/>
+                <w:sz w:val="26"/>
+                <w:szCs w:val="26"/>
               </w:rPr>
               <w:fldChar w:fldCharType="begin"/>
             </w:r>
             <w:r>
               <w:rPr>
                 <w:noProof/>
+                <w:sz w:val="26"/>
+                <w:szCs w:val="26"/>
               </w:rPr>
               <w:instrText xml:space="preserve"> PAGEREF _Toc243990662 \h </w:instrText>
             </w:r>
             <w:r>
               <w:rPr>
                 <w:noProof/>
-              </w:rPr>
-            </w:r>
-            <w:r>
-              <w:rPr>
-                <w:noProof/>
+                <w:sz w:val="26"/>
+                <w:szCs w:val="26"/>
+              </w:rPr>
+            </w:r>
+            <w:r>
+              <w:rPr>
+                <w:noProof/>
+                <w:sz w:val="26"/>
+                <w:szCs w:val="26"/>
               </w:rPr>
               <w:fldChar w:fldCharType="separate"/>
             </w:r>
             <w:r>
               <w:rPr>
                 <w:noProof/>
+                <w:sz w:val="26"/>
+                <w:szCs w:val="26"/>
               </w:rPr>
               <w:t>10</w:t>
             </w:r>
             <w:r>
               <w:rPr>
                 <w:noProof/>
+                <w:sz w:val="26"/>
+                <w:szCs w:val="26"/>
               </w:rPr>
               <w:fldChar w:fldCharType="end"/>
             </w:r>
@@ -1736,8 +2146,8 @@
               <w:rFonts w:asciiTheme="minorHAnsi" w:eastAsiaTheme="minorEastAsia" w:hAnsiTheme="minorHAnsi" w:cstheme="minorBidi"/>
               <w:noProof/>
               <w:kern w:val="2"/>
-              <w:sz w:val="24"/>
-              <w:szCs w:val="24"/>
+              <w:sz w:val="26"/>
+              <w:szCs w:val="26"/>
               <w14:ligatures w14:val="standardContextual"/>
             </w:rPr>
           </w:pPr>
@@ -1746,47 +2156,63 @@
               <w:rPr>
                 <w:rStyle w:val="Hyperlink"/>
                 <w:noProof/>
+                <w:sz w:val="26"/>
+                <w:szCs w:val="26"/>
               </w:rPr>
               <w:t>Bước 9. Thiết kế Layout dùng chung (main.html)</w:t>
             </w:r>
             <w:r>
               <w:rPr>
                 <w:noProof/>
+                <w:sz w:val="26"/>
+                <w:szCs w:val="26"/>
               </w:rPr>
               <w:tab/>
             </w:r>
             <w:r>
               <w:rPr>
                 <w:noProof/>
+                <w:sz w:val="26"/>
+                <w:szCs w:val="26"/>
               </w:rPr>
               <w:fldChar w:fldCharType="begin"/>
             </w:r>
             <w:r>
               <w:rPr>
                 <w:noProof/>
+                <w:sz w:val="26"/>
+                <w:szCs w:val="26"/>
               </w:rPr>
               <w:instrText xml:space="preserve"> PAGEREF _Toc243990663 \h </w:instrText>
             </w:r>
             <w:r>
               <w:rPr>
                 <w:noProof/>
-              </w:rPr>
-            </w:r>
-            <w:r>
-              <w:rPr>
-                <w:noProof/>
+                <w:sz w:val="26"/>
+                <w:szCs w:val="26"/>
+              </w:rPr>
+            </w:r>
+            <w:r>
+              <w:rPr>
+                <w:noProof/>
+                <w:sz w:val="26"/>
+                <w:szCs w:val="26"/>
               </w:rPr>
               <w:fldChar w:fldCharType="separate"/>
             </w:r>
             <w:r>
               <w:rPr>
                 <w:noProof/>
+                <w:sz w:val="26"/>
+                <w:szCs w:val="26"/>
               </w:rPr>
               <w:t>11</w:t>
             </w:r>
             <w:r>
               <w:rPr>
                 <w:noProof/>
+                <w:sz w:val="26"/>
+                <w:szCs w:val="26"/>
               </w:rPr>
               <w:fldChar w:fldCharType="end"/>
             </w:r>
@@ -1802,8 +2228,8 @@
               <w:rFonts w:asciiTheme="minorHAnsi" w:eastAsiaTheme="minorEastAsia" w:hAnsiTheme="minorHAnsi" w:cstheme="minorBidi"/>
               <w:noProof/>
               <w:kern w:val="2"/>
-              <w:sz w:val="24"/>
-              <w:szCs w:val="24"/>
+              <w:sz w:val="26"/>
+              <w:szCs w:val="26"/>
               <w14:ligatures w14:val="standardContextual"/>
             </w:rPr>
           </w:pPr>
@@ -1812,47 +2238,63 @@
               <w:rPr>
                 <w:rStyle w:val="Hyperlink"/>
                 <w:noProof/>
+                <w:sz w:val="26"/>
+                <w:szCs w:val="26"/>
               </w:rPr>
               <w:t>9.1. Cấu hình Head &amp; Thanh điều hướng Navbar</w:t>
             </w:r>
             <w:r>
               <w:rPr>
                 <w:noProof/>
+                <w:sz w:val="26"/>
+                <w:szCs w:val="26"/>
               </w:rPr>
               <w:tab/>
             </w:r>
             <w:r>
               <w:rPr>
                 <w:noProof/>
+                <w:sz w:val="26"/>
+                <w:szCs w:val="26"/>
               </w:rPr>
               <w:fldChar w:fldCharType="begin"/>
             </w:r>
             <w:r>
               <w:rPr>
                 <w:noProof/>
+                <w:sz w:val="26"/>
+                <w:szCs w:val="26"/>
               </w:rPr>
               <w:instrText xml:space="preserve"> PAGEREF _Toc243990664 \h </w:instrText>
             </w:r>
             <w:r>
               <w:rPr>
                 <w:noProof/>
-              </w:rPr>
-            </w:r>
-            <w:r>
-              <w:rPr>
-                <w:noProof/>
+                <w:sz w:val="26"/>
+                <w:szCs w:val="26"/>
+              </w:rPr>
+            </w:r>
+            <w:r>
+              <w:rPr>
+                <w:noProof/>
+                <w:sz w:val="26"/>
+                <w:szCs w:val="26"/>
               </w:rPr>
               <w:fldChar w:fldCharType="separate"/>
             </w:r>
             <w:r>
               <w:rPr>
                 <w:noProof/>
+                <w:sz w:val="26"/>
+                <w:szCs w:val="26"/>
               </w:rPr>
               <w:t>11</w:t>
             </w:r>
             <w:r>
               <w:rPr>
                 <w:noProof/>
+                <w:sz w:val="26"/>
+                <w:szCs w:val="26"/>
               </w:rPr>
               <w:fldChar w:fldCharType="end"/>
             </w:r>
@@ -1868,8 +2310,8 @@
               <w:rFonts w:asciiTheme="minorHAnsi" w:eastAsiaTheme="minorEastAsia" w:hAnsiTheme="minorHAnsi" w:cstheme="minorBidi"/>
               <w:noProof/>
               <w:kern w:val="2"/>
-              <w:sz w:val="24"/>
-              <w:szCs w:val="24"/>
+              <w:sz w:val="26"/>
+              <w:szCs w:val="26"/>
               <w14:ligatures w14:val="standardContextual"/>
             </w:rPr>
           </w:pPr>
@@ -1878,47 +2320,63 @@
               <w:rPr>
                 <w:rStyle w:val="Hyperlink"/>
                 <w:noProof/>
+                <w:sz w:val="26"/>
+                <w:szCs w:val="26"/>
               </w:rPr>
               <w:t>9.2. Vùng nội dung động &amp; Thông báo Flash</w:t>
             </w:r>
             <w:r>
               <w:rPr>
                 <w:noProof/>
+                <w:sz w:val="26"/>
+                <w:szCs w:val="26"/>
               </w:rPr>
               <w:tab/>
             </w:r>
             <w:r>
               <w:rPr>
                 <w:noProof/>
+                <w:sz w:val="26"/>
+                <w:szCs w:val="26"/>
               </w:rPr>
               <w:fldChar w:fldCharType="begin"/>
             </w:r>
             <w:r>
               <w:rPr>
                 <w:noProof/>
+                <w:sz w:val="26"/>
+                <w:szCs w:val="26"/>
               </w:rPr>
               <w:instrText xml:space="preserve"> PAGEREF _Toc243990665 \h </w:instrText>
             </w:r>
             <w:r>
               <w:rPr>
                 <w:noProof/>
-              </w:rPr>
-            </w:r>
-            <w:r>
-              <w:rPr>
-                <w:noProof/>
+                <w:sz w:val="26"/>
+                <w:szCs w:val="26"/>
+              </w:rPr>
+            </w:r>
+            <w:r>
+              <w:rPr>
+                <w:noProof/>
+                <w:sz w:val="26"/>
+                <w:szCs w:val="26"/>
               </w:rPr>
               <w:fldChar w:fldCharType="separate"/>
             </w:r>
             <w:r>
               <w:rPr>
                 <w:noProof/>
+                <w:sz w:val="26"/>
+                <w:szCs w:val="26"/>
               </w:rPr>
               <w:t>12</w:t>
             </w:r>
             <w:r>
               <w:rPr>
                 <w:noProof/>
+                <w:sz w:val="26"/>
+                <w:szCs w:val="26"/>
               </w:rPr>
               <w:fldChar w:fldCharType="end"/>
             </w:r>
@@ -1934,8 +2392,8 @@
               <w:rFonts w:asciiTheme="minorHAnsi" w:eastAsiaTheme="minorEastAsia" w:hAnsiTheme="minorHAnsi" w:cstheme="minorBidi"/>
               <w:noProof/>
               <w:kern w:val="2"/>
-              <w:sz w:val="24"/>
-              <w:szCs w:val="24"/>
+              <w:sz w:val="26"/>
+              <w:szCs w:val="26"/>
               <w14:ligatures w14:val="standardContextual"/>
             </w:rPr>
           </w:pPr>
@@ -1944,47 +2402,63 @@
               <w:rPr>
                 <w:rStyle w:val="Hyperlink"/>
                 <w:noProof/>
+                <w:sz w:val="26"/>
+                <w:szCs w:val="26"/>
               </w:rPr>
               <w:t>Bước 10. Xây dựng Trang danh sách sinh viên (list.html)</w:t>
             </w:r>
             <w:r>
               <w:rPr>
                 <w:noProof/>
+                <w:sz w:val="26"/>
+                <w:szCs w:val="26"/>
               </w:rPr>
               <w:tab/>
             </w:r>
             <w:r>
               <w:rPr>
                 <w:noProof/>
+                <w:sz w:val="26"/>
+                <w:szCs w:val="26"/>
               </w:rPr>
               <w:fldChar w:fldCharType="begin"/>
             </w:r>
             <w:r>
               <w:rPr>
                 <w:noProof/>
+                <w:sz w:val="26"/>
+                <w:szCs w:val="26"/>
               </w:rPr>
               <w:instrText xml:space="preserve"> PAGEREF _Toc243990666 \h </w:instrText>
             </w:r>
             <w:r>
               <w:rPr>
                 <w:noProof/>
-              </w:rPr>
-            </w:r>
-            <w:r>
-              <w:rPr>
-                <w:noProof/>
+                <w:sz w:val="26"/>
+                <w:szCs w:val="26"/>
+              </w:rPr>
+            </w:r>
+            <w:r>
+              <w:rPr>
+                <w:noProof/>
+                <w:sz w:val="26"/>
+                <w:szCs w:val="26"/>
               </w:rPr>
               <w:fldChar w:fldCharType="separate"/>
             </w:r>
             <w:r>
               <w:rPr>
                 <w:noProof/>
+                <w:sz w:val="26"/>
+                <w:szCs w:val="26"/>
               </w:rPr>
               <w:t>13</w:t>
             </w:r>
             <w:r>
               <w:rPr>
                 <w:noProof/>
+                <w:sz w:val="26"/>
+                <w:szCs w:val="26"/>
               </w:rPr>
               <w:fldChar w:fldCharType="end"/>
             </w:r>
@@ -2000,8 +2474,8 @@
               <w:rFonts w:asciiTheme="minorHAnsi" w:eastAsiaTheme="minorEastAsia" w:hAnsiTheme="minorHAnsi" w:cstheme="minorBidi"/>
               <w:noProof/>
               <w:kern w:val="2"/>
-              <w:sz w:val="24"/>
-              <w:szCs w:val="24"/>
+              <w:sz w:val="26"/>
+              <w:szCs w:val="26"/>
               <w14:ligatures w14:val="standardContextual"/>
             </w:rPr>
           </w:pPr>
@@ -2010,47 +2484,63 @@
               <w:rPr>
                 <w:rStyle w:val="Hyperlink"/>
                 <w:noProof/>
+                <w:sz w:val="26"/>
+                <w:szCs w:val="26"/>
               </w:rPr>
               <w:t>10.1. Code phần Tìm kiếm &amp; Tiêu đề</w:t>
             </w:r>
             <w:r>
               <w:rPr>
                 <w:noProof/>
+                <w:sz w:val="26"/>
+                <w:szCs w:val="26"/>
               </w:rPr>
               <w:tab/>
             </w:r>
             <w:r>
               <w:rPr>
                 <w:noProof/>
+                <w:sz w:val="26"/>
+                <w:szCs w:val="26"/>
               </w:rPr>
               <w:fldChar w:fldCharType="begin"/>
             </w:r>
             <w:r>
               <w:rPr>
                 <w:noProof/>
+                <w:sz w:val="26"/>
+                <w:szCs w:val="26"/>
               </w:rPr>
               <w:instrText xml:space="preserve"> PAGEREF _Toc243990667 \h </w:instrText>
             </w:r>
             <w:r>
               <w:rPr>
                 <w:noProof/>
-              </w:rPr>
-            </w:r>
-            <w:r>
-              <w:rPr>
-                <w:noProof/>
+                <w:sz w:val="26"/>
+                <w:szCs w:val="26"/>
+              </w:rPr>
+            </w:r>
+            <w:r>
+              <w:rPr>
+                <w:noProof/>
+                <w:sz w:val="26"/>
+                <w:szCs w:val="26"/>
               </w:rPr>
               <w:fldChar w:fldCharType="separate"/>
             </w:r>
             <w:r>
               <w:rPr>
                 <w:noProof/>
+                <w:sz w:val="26"/>
+                <w:szCs w:val="26"/>
               </w:rPr>
               <w:t>13</w:t>
             </w:r>
             <w:r>
               <w:rPr>
                 <w:noProof/>
+                <w:sz w:val="26"/>
+                <w:szCs w:val="26"/>
               </w:rPr>
               <w:fldChar w:fldCharType="end"/>
             </w:r>
@@ -2066,8 +2556,8 @@
               <w:rFonts w:asciiTheme="minorHAnsi" w:eastAsiaTheme="minorEastAsia" w:hAnsiTheme="minorHAnsi" w:cstheme="minorBidi"/>
               <w:noProof/>
               <w:kern w:val="2"/>
-              <w:sz w:val="24"/>
-              <w:szCs w:val="24"/>
+              <w:sz w:val="26"/>
+              <w:szCs w:val="26"/>
               <w14:ligatures w14:val="standardContextual"/>
             </w:rPr>
           </w:pPr>
@@ -2076,47 +2566,63 @@
               <w:rPr>
                 <w:rStyle w:val="Hyperlink"/>
                 <w:noProof/>
+                <w:sz w:val="26"/>
+                <w:szCs w:val="26"/>
               </w:rPr>
               <w:t>10.2. Code phần Bảng dữ liệu sinh viên</w:t>
             </w:r>
             <w:r>
               <w:rPr>
                 <w:noProof/>
+                <w:sz w:val="26"/>
+                <w:szCs w:val="26"/>
               </w:rPr>
               <w:tab/>
             </w:r>
             <w:r>
               <w:rPr>
                 <w:noProof/>
+                <w:sz w:val="26"/>
+                <w:szCs w:val="26"/>
               </w:rPr>
               <w:fldChar w:fldCharType="begin"/>
             </w:r>
             <w:r>
               <w:rPr>
                 <w:noProof/>
+                <w:sz w:val="26"/>
+                <w:szCs w:val="26"/>
               </w:rPr>
               <w:instrText xml:space="preserve"> PAGEREF _Toc243990668 \h </w:instrText>
             </w:r>
             <w:r>
               <w:rPr>
                 <w:noProof/>
-              </w:rPr>
-            </w:r>
-            <w:r>
-              <w:rPr>
-                <w:noProof/>
+                <w:sz w:val="26"/>
+                <w:szCs w:val="26"/>
+              </w:rPr>
+            </w:r>
+            <w:r>
+              <w:rPr>
+                <w:noProof/>
+                <w:sz w:val="26"/>
+                <w:szCs w:val="26"/>
               </w:rPr>
               <w:fldChar w:fldCharType="separate"/>
             </w:r>
             <w:r>
               <w:rPr>
                 <w:noProof/>
+                <w:sz w:val="26"/>
+                <w:szCs w:val="26"/>
               </w:rPr>
               <w:t>14</w:t>
             </w:r>
             <w:r>
               <w:rPr>
                 <w:noProof/>
+                <w:sz w:val="26"/>
+                <w:szCs w:val="26"/>
               </w:rPr>
               <w:fldChar w:fldCharType="end"/>
             </w:r>
@@ -2132,8 +2638,8 @@
               <w:rFonts w:asciiTheme="minorHAnsi" w:eastAsiaTheme="minorEastAsia" w:hAnsiTheme="minorHAnsi" w:cstheme="minorBidi"/>
               <w:noProof/>
               <w:kern w:val="2"/>
-              <w:sz w:val="24"/>
-              <w:szCs w:val="24"/>
+              <w:sz w:val="26"/>
+              <w:szCs w:val="26"/>
               <w14:ligatures w14:val="standardContextual"/>
             </w:rPr>
           </w:pPr>
@@ -2142,47 +2648,63 @@
               <w:rPr>
                 <w:rStyle w:val="Hyperlink"/>
                 <w:noProof/>
+                <w:sz w:val="26"/>
+                <w:szCs w:val="26"/>
               </w:rPr>
               <w:t>10.3. Giao diện danh sách sinh viên trên trình duyệt</w:t>
             </w:r>
             <w:r>
               <w:rPr>
                 <w:noProof/>
+                <w:sz w:val="26"/>
+                <w:szCs w:val="26"/>
               </w:rPr>
               <w:tab/>
             </w:r>
             <w:r>
               <w:rPr>
                 <w:noProof/>
+                <w:sz w:val="26"/>
+                <w:szCs w:val="26"/>
               </w:rPr>
               <w:fldChar w:fldCharType="begin"/>
             </w:r>
             <w:r>
               <w:rPr>
                 <w:noProof/>
+                <w:sz w:val="26"/>
+                <w:szCs w:val="26"/>
               </w:rPr>
               <w:instrText xml:space="preserve"> PAGEREF _Toc243990669 \h </w:instrText>
             </w:r>
             <w:r>
               <w:rPr>
                 <w:noProof/>
-              </w:rPr>
-            </w:r>
-            <w:r>
-              <w:rPr>
-                <w:noProof/>
+                <w:sz w:val="26"/>
+                <w:szCs w:val="26"/>
+              </w:rPr>
+            </w:r>
+            <w:r>
+              <w:rPr>
+                <w:noProof/>
+                <w:sz w:val="26"/>
+                <w:szCs w:val="26"/>
               </w:rPr>
               <w:fldChar w:fldCharType="separate"/>
             </w:r>
             <w:r>
               <w:rPr>
                 <w:noProof/>
+                <w:sz w:val="26"/>
+                <w:szCs w:val="26"/>
               </w:rPr>
               <w:t>15</w:t>
             </w:r>
             <w:r>
               <w:rPr>
                 <w:noProof/>
+                <w:sz w:val="26"/>
+                <w:szCs w:val="26"/>
               </w:rPr>
               <w:fldChar w:fldCharType="end"/>
             </w:r>
@@ -2198,8 +2720,8 @@
               <w:rFonts w:asciiTheme="minorHAnsi" w:eastAsiaTheme="minorEastAsia" w:hAnsiTheme="minorHAnsi" w:cstheme="minorBidi"/>
               <w:noProof/>
               <w:kern w:val="2"/>
-              <w:sz w:val="24"/>
-              <w:szCs w:val="24"/>
+              <w:sz w:val="26"/>
+              <w:szCs w:val="26"/>
               <w14:ligatures w14:val="standardContextual"/>
             </w:rPr>
           </w:pPr>
@@ -2208,47 +2730,63 @@
               <w:rPr>
                 <w:rStyle w:val="Hyperlink"/>
                 <w:noProof/>
+                <w:sz w:val="26"/>
+                <w:szCs w:val="26"/>
               </w:rPr>
               <w:t>10.4. Kiểm thử chức năng tìm kiếm</w:t>
             </w:r>
             <w:r>
               <w:rPr>
                 <w:noProof/>
+                <w:sz w:val="26"/>
+                <w:szCs w:val="26"/>
               </w:rPr>
               <w:tab/>
             </w:r>
             <w:r>
               <w:rPr>
                 <w:noProof/>
+                <w:sz w:val="26"/>
+                <w:szCs w:val="26"/>
               </w:rPr>
               <w:fldChar w:fldCharType="begin"/>
             </w:r>
             <w:r>
               <w:rPr>
                 <w:noProof/>
+                <w:sz w:val="26"/>
+                <w:szCs w:val="26"/>
               </w:rPr>
               <w:instrText xml:space="preserve"> PAGEREF _Toc243990670 \h </w:instrText>
             </w:r>
             <w:r>
               <w:rPr>
                 <w:noProof/>
-              </w:rPr>
-            </w:r>
-            <w:r>
-              <w:rPr>
-                <w:noProof/>
+                <w:sz w:val="26"/>
+                <w:szCs w:val="26"/>
+              </w:rPr>
+            </w:r>
+            <w:r>
+              <w:rPr>
+                <w:noProof/>
+                <w:sz w:val="26"/>
+                <w:szCs w:val="26"/>
               </w:rPr>
               <w:fldChar w:fldCharType="separate"/>
             </w:r>
             <w:r>
               <w:rPr>
                 <w:noProof/>
+                <w:sz w:val="26"/>
+                <w:szCs w:val="26"/>
               </w:rPr>
               <w:t>15</w:t>
             </w:r>
             <w:r>
               <w:rPr>
                 <w:noProof/>
+                <w:sz w:val="26"/>
+                <w:szCs w:val="26"/>
               </w:rPr>
               <w:fldChar w:fldCharType="end"/>
             </w:r>
@@ -2264,8 +2802,8 @@
               <w:rFonts w:asciiTheme="minorHAnsi" w:eastAsiaTheme="minorEastAsia" w:hAnsiTheme="minorHAnsi" w:cstheme="minorBidi"/>
               <w:noProof/>
               <w:kern w:val="2"/>
-              <w:sz w:val="24"/>
-              <w:szCs w:val="24"/>
+              <w:sz w:val="26"/>
+              <w:szCs w:val="26"/>
               <w14:ligatures w14:val="standardContextual"/>
             </w:rPr>
           </w:pPr>
@@ -2274,47 +2812,63 @@
               <w:rPr>
                 <w:rStyle w:val="Hyperlink"/>
                 <w:noProof/>
+                <w:sz w:val="26"/>
+                <w:szCs w:val="26"/>
               </w:rPr>
               <w:t>Bước 11. Xây dựng Trang chi tiết sinh viên (detail.html)</w:t>
             </w:r>
             <w:r>
               <w:rPr>
                 <w:noProof/>
+                <w:sz w:val="26"/>
+                <w:szCs w:val="26"/>
               </w:rPr>
               <w:tab/>
             </w:r>
             <w:r>
               <w:rPr>
                 <w:noProof/>
+                <w:sz w:val="26"/>
+                <w:szCs w:val="26"/>
               </w:rPr>
               <w:fldChar w:fldCharType="begin"/>
             </w:r>
             <w:r>
               <w:rPr>
                 <w:noProof/>
+                <w:sz w:val="26"/>
+                <w:szCs w:val="26"/>
               </w:rPr>
               <w:instrText xml:space="preserve"> PAGEREF _Toc243990671 \h </w:instrText>
             </w:r>
             <w:r>
               <w:rPr>
                 <w:noProof/>
-              </w:rPr>
-            </w:r>
-            <w:r>
-              <w:rPr>
-                <w:noProof/>
+                <w:sz w:val="26"/>
+                <w:szCs w:val="26"/>
+              </w:rPr>
+            </w:r>
+            <w:r>
+              <w:rPr>
+                <w:noProof/>
+                <w:sz w:val="26"/>
+                <w:szCs w:val="26"/>
               </w:rPr>
               <w:fldChar w:fldCharType="separate"/>
             </w:r>
             <w:r>
               <w:rPr>
                 <w:noProof/>
+                <w:sz w:val="26"/>
+                <w:szCs w:val="26"/>
               </w:rPr>
               <w:t>16</w:t>
             </w:r>
             <w:r>
               <w:rPr>
                 <w:noProof/>
+                <w:sz w:val="26"/>
+                <w:szCs w:val="26"/>
               </w:rPr>
               <w:fldChar w:fldCharType="end"/>
             </w:r>
@@ -2330,8 +2884,8 @@
               <w:rFonts w:asciiTheme="minorHAnsi" w:eastAsiaTheme="minorEastAsia" w:hAnsiTheme="minorHAnsi" w:cstheme="minorBidi"/>
               <w:noProof/>
               <w:kern w:val="2"/>
-              <w:sz w:val="24"/>
-              <w:szCs w:val="24"/>
+              <w:sz w:val="26"/>
+              <w:szCs w:val="26"/>
               <w14:ligatures w14:val="standardContextual"/>
             </w:rPr>
           </w:pPr>
@@ -2340,47 +2894,63 @@
               <w:rPr>
                 <w:rStyle w:val="Hyperlink"/>
                 <w:noProof/>
+                <w:sz w:val="26"/>
+                <w:szCs w:val="26"/>
               </w:rPr>
               <w:t>11.1. Mã nguồn trang chi tiết</w:t>
             </w:r>
             <w:r>
               <w:rPr>
                 <w:noProof/>
+                <w:sz w:val="26"/>
+                <w:szCs w:val="26"/>
               </w:rPr>
               <w:tab/>
             </w:r>
             <w:r>
               <w:rPr>
                 <w:noProof/>
+                <w:sz w:val="26"/>
+                <w:szCs w:val="26"/>
               </w:rPr>
               <w:fldChar w:fldCharType="begin"/>
             </w:r>
             <w:r>
               <w:rPr>
                 <w:noProof/>
+                <w:sz w:val="26"/>
+                <w:szCs w:val="26"/>
               </w:rPr>
               <w:instrText xml:space="preserve"> PAGEREF _Toc243990672 \h </w:instrText>
             </w:r>
             <w:r>
               <w:rPr>
                 <w:noProof/>
-              </w:rPr>
-            </w:r>
-            <w:r>
-              <w:rPr>
-                <w:noProof/>
+                <w:sz w:val="26"/>
+                <w:szCs w:val="26"/>
+              </w:rPr>
+            </w:r>
+            <w:r>
+              <w:rPr>
+                <w:noProof/>
+                <w:sz w:val="26"/>
+                <w:szCs w:val="26"/>
               </w:rPr>
               <w:fldChar w:fldCharType="separate"/>
             </w:r>
             <w:r>
               <w:rPr>
                 <w:noProof/>
+                <w:sz w:val="26"/>
+                <w:szCs w:val="26"/>
               </w:rPr>
               <w:t>16</w:t>
             </w:r>
             <w:r>
               <w:rPr>
                 <w:noProof/>
+                <w:sz w:val="26"/>
+                <w:szCs w:val="26"/>
               </w:rPr>
               <w:fldChar w:fldCharType="end"/>
             </w:r>
@@ -2396,8 +2966,8 @@
               <w:rFonts w:asciiTheme="minorHAnsi" w:eastAsiaTheme="minorEastAsia" w:hAnsiTheme="minorHAnsi" w:cstheme="minorBidi"/>
               <w:noProof/>
               <w:kern w:val="2"/>
-              <w:sz w:val="24"/>
-              <w:szCs w:val="24"/>
+              <w:sz w:val="26"/>
+              <w:szCs w:val="26"/>
               <w14:ligatures w14:val="standardContextual"/>
             </w:rPr>
           </w:pPr>
@@ -2406,47 +2976,63 @@
               <w:rPr>
                 <w:rStyle w:val="Hyperlink"/>
                 <w:noProof/>
+                <w:sz w:val="26"/>
+                <w:szCs w:val="26"/>
               </w:rPr>
               <w:t>11.2. Chi tiết sinh viên đủ điều kiện xét học bổng</w:t>
             </w:r>
             <w:r>
               <w:rPr>
                 <w:noProof/>
+                <w:sz w:val="26"/>
+                <w:szCs w:val="26"/>
               </w:rPr>
               <w:tab/>
             </w:r>
             <w:r>
               <w:rPr>
                 <w:noProof/>
+                <w:sz w:val="26"/>
+                <w:szCs w:val="26"/>
               </w:rPr>
               <w:fldChar w:fldCharType="begin"/>
             </w:r>
             <w:r>
               <w:rPr>
                 <w:noProof/>
+                <w:sz w:val="26"/>
+                <w:szCs w:val="26"/>
               </w:rPr>
               <w:instrText xml:space="preserve"> PAGEREF _Toc243990673 \h </w:instrText>
             </w:r>
             <w:r>
               <w:rPr>
                 <w:noProof/>
-              </w:rPr>
-            </w:r>
-            <w:r>
-              <w:rPr>
-                <w:noProof/>
+                <w:sz w:val="26"/>
+                <w:szCs w:val="26"/>
+              </w:rPr>
+            </w:r>
+            <w:r>
+              <w:rPr>
+                <w:noProof/>
+                <w:sz w:val="26"/>
+                <w:szCs w:val="26"/>
               </w:rPr>
               <w:fldChar w:fldCharType="separate"/>
             </w:r>
             <w:r>
               <w:rPr>
                 <w:noProof/>
+                <w:sz w:val="26"/>
+                <w:szCs w:val="26"/>
               </w:rPr>
               <w:t>16</w:t>
             </w:r>
             <w:r>
               <w:rPr>
                 <w:noProof/>
+                <w:sz w:val="26"/>
+                <w:szCs w:val="26"/>
               </w:rPr>
               <w:fldChar w:fldCharType="end"/>
             </w:r>
@@ -2462,8 +3048,8 @@
               <w:rFonts w:asciiTheme="minorHAnsi" w:eastAsiaTheme="minorEastAsia" w:hAnsiTheme="minorHAnsi" w:cstheme="minorBidi"/>
               <w:noProof/>
               <w:kern w:val="2"/>
-              <w:sz w:val="24"/>
-              <w:szCs w:val="24"/>
+              <w:sz w:val="26"/>
+              <w:szCs w:val="26"/>
               <w14:ligatures w14:val="standardContextual"/>
             </w:rPr>
           </w:pPr>
@@ -2472,47 +3058,63 @@
               <w:rPr>
                 <w:rStyle w:val="Hyperlink"/>
                 <w:noProof/>
+                <w:sz w:val="26"/>
+                <w:szCs w:val="26"/>
               </w:rPr>
               <w:t>11.3. Chi tiết sinh viên không đủ điều kiện học bổng</w:t>
             </w:r>
             <w:r>
               <w:rPr>
                 <w:noProof/>
+                <w:sz w:val="26"/>
+                <w:szCs w:val="26"/>
               </w:rPr>
               <w:tab/>
             </w:r>
             <w:r>
               <w:rPr>
                 <w:noProof/>
+                <w:sz w:val="26"/>
+                <w:szCs w:val="26"/>
               </w:rPr>
               <w:fldChar w:fldCharType="begin"/>
             </w:r>
             <w:r>
               <w:rPr>
                 <w:noProof/>
+                <w:sz w:val="26"/>
+                <w:szCs w:val="26"/>
               </w:rPr>
               <w:instrText xml:space="preserve"> PAGEREF _Toc243990674 \h </w:instrText>
             </w:r>
             <w:r>
               <w:rPr>
                 <w:noProof/>
-              </w:rPr>
-            </w:r>
-            <w:r>
-              <w:rPr>
-                <w:noProof/>
+                <w:sz w:val="26"/>
+                <w:szCs w:val="26"/>
+              </w:rPr>
+            </w:r>
+            <w:r>
+              <w:rPr>
+                <w:noProof/>
+                <w:sz w:val="26"/>
+                <w:szCs w:val="26"/>
               </w:rPr>
               <w:fldChar w:fldCharType="separate"/>
             </w:r>
             <w:r>
               <w:rPr>
                 <w:noProof/>
+                <w:sz w:val="26"/>
+                <w:szCs w:val="26"/>
               </w:rPr>
               <w:t>17</w:t>
             </w:r>
             <w:r>
               <w:rPr>
                 <w:noProof/>
+                <w:sz w:val="26"/>
+                <w:szCs w:val="26"/>
               </w:rPr>
               <w:fldChar w:fldCharType="end"/>
             </w:r>
@@ -2528,8 +3130,8 @@
               <w:rFonts w:asciiTheme="minorHAnsi" w:eastAsiaTheme="minorEastAsia" w:hAnsiTheme="minorHAnsi" w:cstheme="minorBidi"/>
               <w:noProof/>
               <w:kern w:val="2"/>
-              <w:sz w:val="24"/>
-              <w:szCs w:val="24"/>
+              <w:sz w:val="26"/>
+              <w:szCs w:val="26"/>
               <w14:ligatures w14:val="standardContextual"/>
             </w:rPr>
           </w:pPr>
@@ -2538,47 +3140,63 @@
               <w:rPr>
                 <w:rStyle w:val="Hyperlink"/>
                 <w:noProof/>
+                <w:sz w:val="26"/>
+                <w:szCs w:val="26"/>
               </w:rPr>
               <w:t>11.4. Xử lý ngoại lệ ID không tồn tại</w:t>
             </w:r>
             <w:r>
               <w:rPr>
                 <w:noProof/>
+                <w:sz w:val="26"/>
+                <w:szCs w:val="26"/>
               </w:rPr>
               <w:tab/>
             </w:r>
             <w:r>
               <w:rPr>
                 <w:noProof/>
+                <w:sz w:val="26"/>
+                <w:szCs w:val="26"/>
               </w:rPr>
               <w:fldChar w:fldCharType="begin"/>
             </w:r>
             <w:r>
               <w:rPr>
                 <w:noProof/>
+                <w:sz w:val="26"/>
+                <w:szCs w:val="26"/>
               </w:rPr>
               <w:instrText xml:space="preserve"> PAGEREF _Toc243990675 \h </w:instrText>
             </w:r>
             <w:r>
               <w:rPr>
                 <w:noProof/>
-              </w:rPr>
-            </w:r>
-            <w:r>
-              <w:rPr>
-                <w:noProof/>
+                <w:sz w:val="26"/>
+                <w:szCs w:val="26"/>
+              </w:rPr>
+            </w:r>
+            <w:r>
+              <w:rPr>
+                <w:noProof/>
+                <w:sz w:val="26"/>
+                <w:szCs w:val="26"/>
               </w:rPr>
               <w:fldChar w:fldCharType="separate"/>
             </w:r>
             <w:r>
               <w:rPr>
                 <w:noProof/>
+                <w:sz w:val="26"/>
+                <w:szCs w:val="26"/>
               </w:rPr>
               <w:t>17</w:t>
             </w:r>
             <w:r>
               <w:rPr>
                 <w:noProof/>
+                <w:sz w:val="26"/>
+                <w:szCs w:val="26"/>
               </w:rPr>
               <w:fldChar w:fldCharType="end"/>
             </w:r>
@@ -2594,8 +3212,8 @@
               <w:rFonts w:asciiTheme="minorHAnsi" w:eastAsiaTheme="minorEastAsia" w:hAnsiTheme="minorHAnsi" w:cstheme="minorBidi"/>
               <w:noProof/>
               <w:kern w:val="2"/>
-              <w:sz w:val="24"/>
-              <w:szCs w:val="24"/>
+              <w:sz w:val="26"/>
+              <w:szCs w:val="26"/>
               <w14:ligatures w14:val="standardContextual"/>
             </w:rPr>
           </w:pPr>
@@ -2604,47 +3222,63 @@
               <w:rPr>
                 <w:rStyle w:val="Hyperlink"/>
                 <w:noProof/>
+                <w:sz w:val="26"/>
+                <w:szCs w:val="26"/>
               </w:rPr>
               <w:t>Bước 12. Xây dựng Form Thêm / Cập nhật (form.html)</w:t>
             </w:r>
             <w:r>
               <w:rPr>
                 <w:noProof/>
+                <w:sz w:val="26"/>
+                <w:szCs w:val="26"/>
               </w:rPr>
               <w:tab/>
             </w:r>
             <w:r>
               <w:rPr>
                 <w:noProof/>
+                <w:sz w:val="26"/>
+                <w:szCs w:val="26"/>
               </w:rPr>
               <w:fldChar w:fldCharType="begin"/>
             </w:r>
             <w:r>
               <w:rPr>
                 <w:noProof/>
+                <w:sz w:val="26"/>
+                <w:szCs w:val="26"/>
               </w:rPr>
               <w:instrText xml:space="preserve"> PAGEREF _Toc243990676 \h </w:instrText>
             </w:r>
             <w:r>
               <w:rPr>
                 <w:noProof/>
-              </w:rPr>
-            </w:r>
-            <w:r>
-              <w:rPr>
-                <w:noProof/>
+                <w:sz w:val="26"/>
+                <w:szCs w:val="26"/>
+              </w:rPr>
+            </w:r>
+            <w:r>
+              <w:rPr>
+                <w:noProof/>
+                <w:sz w:val="26"/>
+                <w:szCs w:val="26"/>
               </w:rPr>
               <w:fldChar w:fldCharType="separate"/>
             </w:r>
             <w:r>
               <w:rPr>
                 <w:noProof/>
+                <w:sz w:val="26"/>
+                <w:szCs w:val="26"/>
               </w:rPr>
               <w:t>18</w:t>
             </w:r>
             <w:r>
               <w:rPr>
                 <w:noProof/>
+                <w:sz w:val="26"/>
+                <w:szCs w:val="26"/>
               </w:rPr>
               <w:fldChar w:fldCharType="end"/>
             </w:r>
@@ -2660,8 +3294,8 @@
               <w:rFonts w:asciiTheme="minorHAnsi" w:eastAsiaTheme="minorEastAsia" w:hAnsiTheme="minorHAnsi" w:cstheme="minorBidi"/>
               <w:noProof/>
               <w:kern w:val="2"/>
-              <w:sz w:val="24"/>
-              <w:szCs w:val="24"/>
+              <w:sz w:val="26"/>
+              <w:szCs w:val="26"/>
               <w14:ligatures w14:val="standardContextual"/>
             </w:rPr>
           </w:pPr>
@@ -2670,47 +3304,63 @@
               <w:rPr>
                 <w:rStyle w:val="Hyperlink"/>
                 <w:noProof/>
+                <w:sz w:val="26"/>
+                <w:szCs w:val="26"/>
               </w:rPr>
               <w:t>12.1. Mã nguồn Form (phần đầu &amp; khối tổng hợp lỗi)</w:t>
             </w:r>
             <w:r>
               <w:rPr>
                 <w:noProof/>
+                <w:sz w:val="26"/>
+                <w:szCs w:val="26"/>
               </w:rPr>
               <w:tab/>
             </w:r>
             <w:r>
               <w:rPr>
                 <w:noProof/>
+                <w:sz w:val="26"/>
+                <w:szCs w:val="26"/>
               </w:rPr>
               <w:fldChar w:fldCharType="begin"/>
             </w:r>
             <w:r>
               <w:rPr>
                 <w:noProof/>
+                <w:sz w:val="26"/>
+                <w:szCs w:val="26"/>
               </w:rPr>
               <w:instrText xml:space="preserve"> PAGEREF _Toc243990677 \h </w:instrText>
             </w:r>
             <w:r>
               <w:rPr>
                 <w:noProof/>
-              </w:rPr>
-            </w:r>
-            <w:r>
-              <w:rPr>
-                <w:noProof/>
+                <w:sz w:val="26"/>
+                <w:szCs w:val="26"/>
+              </w:rPr>
+            </w:r>
+            <w:r>
+              <w:rPr>
+                <w:noProof/>
+                <w:sz w:val="26"/>
+                <w:szCs w:val="26"/>
               </w:rPr>
               <w:fldChar w:fldCharType="separate"/>
             </w:r>
             <w:r>
               <w:rPr>
                 <w:noProof/>
+                <w:sz w:val="26"/>
+                <w:szCs w:val="26"/>
               </w:rPr>
               <w:t>18</w:t>
             </w:r>
             <w:r>
               <w:rPr>
                 <w:noProof/>
+                <w:sz w:val="26"/>
+                <w:szCs w:val="26"/>
               </w:rPr>
               <w:fldChar w:fldCharType="end"/>
             </w:r>
@@ -2726,8 +3376,8 @@
               <w:rFonts w:asciiTheme="minorHAnsi" w:eastAsiaTheme="minorEastAsia" w:hAnsiTheme="minorHAnsi" w:cstheme="minorBidi"/>
               <w:noProof/>
               <w:kern w:val="2"/>
-              <w:sz w:val="24"/>
-              <w:szCs w:val="24"/>
+              <w:sz w:val="26"/>
+              <w:szCs w:val="26"/>
               <w14:ligatures w14:val="standardContextual"/>
             </w:rPr>
           </w:pPr>
@@ -2736,47 +3386,63 @@
               <w:rPr>
                 <w:rStyle w:val="Hyperlink"/>
                 <w:noProof/>
+                <w:sz w:val="26"/>
+                <w:szCs w:val="26"/>
               </w:rPr>
               <w:t>12.2. Giao diện Form thêm mới sinh viên</w:t>
             </w:r>
             <w:r>
               <w:rPr>
                 <w:noProof/>
+                <w:sz w:val="26"/>
+                <w:szCs w:val="26"/>
               </w:rPr>
               <w:tab/>
             </w:r>
             <w:r>
               <w:rPr>
                 <w:noProof/>
+                <w:sz w:val="26"/>
+                <w:szCs w:val="26"/>
               </w:rPr>
               <w:fldChar w:fldCharType="begin"/>
             </w:r>
             <w:r>
               <w:rPr>
                 <w:noProof/>
+                <w:sz w:val="26"/>
+                <w:szCs w:val="26"/>
               </w:rPr>
               <w:instrText xml:space="preserve"> PAGEREF _Toc243990678 \h </w:instrText>
             </w:r>
             <w:r>
               <w:rPr>
                 <w:noProof/>
-              </w:rPr>
-            </w:r>
-            <w:r>
-              <w:rPr>
-                <w:noProof/>
+                <w:sz w:val="26"/>
+                <w:szCs w:val="26"/>
+              </w:rPr>
+            </w:r>
+            <w:r>
+              <w:rPr>
+                <w:noProof/>
+                <w:sz w:val="26"/>
+                <w:szCs w:val="26"/>
               </w:rPr>
               <w:fldChar w:fldCharType="separate"/>
             </w:r>
             <w:r>
               <w:rPr>
                 <w:noProof/>
+                <w:sz w:val="26"/>
+                <w:szCs w:val="26"/>
               </w:rPr>
               <w:t>18</w:t>
             </w:r>
             <w:r>
               <w:rPr>
                 <w:noProof/>
+                <w:sz w:val="26"/>
+                <w:szCs w:val="26"/>
               </w:rPr>
               <w:fldChar w:fldCharType="end"/>
             </w:r>
@@ -2792,8 +3458,8 @@
               <w:rFonts w:asciiTheme="minorHAnsi" w:eastAsiaTheme="minorEastAsia" w:hAnsiTheme="minorHAnsi" w:cstheme="minorBidi"/>
               <w:noProof/>
               <w:kern w:val="2"/>
-              <w:sz w:val="24"/>
-              <w:szCs w:val="24"/>
+              <w:sz w:val="26"/>
+              <w:szCs w:val="26"/>
               <w14:ligatures w14:val="standardContextual"/>
             </w:rPr>
           </w:pPr>
@@ -2802,47 +3468,63 @@
               <w:rPr>
                 <w:rStyle w:val="Hyperlink"/>
                 <w:noProof/>
+                <w:sz w:val="26"/>
+                <w:szCs w:val="26"/>
               </w:rPr>
               <w:t>12.3. Kiểm thử bắt lỗi Validation khi để trống dữ liệu</w:t>
             </w:r>
             <w:r>
               <w:rPr>
                 <w:noProof/>
+                <w:sz w:val="26"/>
+                <w:szCs w:val="26"/>
               </w:rPr>
               <w:tab/>
             </w:r>
             <w:r>
               <w:rPr>
                 <w:noProof/>
+                <w:sz w:val="26"/>
+                <w:szCs w:val="26"/>
               </w:rPr>
               <w:fldChar w:fldCharType="begin"/>
             </w:r>
             <w:r>
               <w:rPr>
                 <w:noProof/>
+                <w:sz w:val="26"/>
+                <w:szCs w:val="26"/>
               </w:rPr>
               <w:instrText xml:space="preserve"> PAGEREF _Toc243990679 \h </w:instrText>
             </w:r>
             <w:r>
               <w:rPr>
                 <w:noProof/>
-              </w:rPr>
-            </w:r>
-            <w:r>
-              <w:rPr>
-                <w:noProof/>
+                <w:sz w:val="26"/>
+                <w:szCs w:val="26"/>
+              </w:rPr>
+            </w:r>
+            <w:r>
+              <w:rPr>
+                <w:noProof/>
+                <w:sz w:val="26"/>
+                <w:szCs w:val="26"/>
               </w:rPr>
               <w:fldChar w:fldCharType="separate"/>
             </w:r>
             <w:r>
               <w:rPr>
                 <w:noProof/>
+                <w:sz w:val="26"/>
+                <w:szCs w:val="26"/>
               </w:rPr>
               <w:t>19</w:t>
             </w:r>
             <w:r>
               <w:rPr>
                 <w:noProof/>
+                <w:sz w:val="26"/>
+                <w:szCs w:val="26"/>
               </w:rPr>
               <w:fldChar w:fldCharType="end"/>
             </w:r>
@@ -2858,8 +3540,8 @@
               <w:rFonts w:asciiTheme="minorHAnsi" w:eastAsiaTheme="minorEastAsia" w:hAnsiTheme="minorHAnsi" w:cstheme="minorBidi"/>
               <w:noProof/>
               <w:kern w:val="2"/>
-              <w:sz w:val="24"/>
-              <w:szCs w:val="24"/>
+              <w:sz w:val="26"/>
+              <w:szCs w:val="26"/>
               <w14:ligatures w14:val="standardContextual"/>
             </w:rPr>
           </w:pPr>
@@ -2868,47 +3550,63 @@
               <w:rPr>
                 <w:rStyle w:val="Hyperlink"/>
                 <w:noProof/>
+                <w:sz w:val="26"/>
+                <w:szCs w:val="26"/>
               </w:rPr>
               <w:t>12.4. Kiểm thử lỗi trùng mã sinh viên &amp; Type Mismatch</w:t>
             </w:r>
             <w:r>
               <w:rPr>
                 <w:noProof/>
+                <w:sz w:val="26"/>
+                <w:szCs w:val="26"/>
               </w:rPr>
               <w:tab/>
             </w:r>
             <w:r>
               <w:rPr>
                 <w:noProof/>
+                <w:sz w:val="26"/>
+                <w:szCs w:val="26"/>
               </w:rPr>
               <w:fldChar w:fldCharType="begin"/>
             </w:r>
             <w:r>
               <w:rPr>
                 <w:noProof/>
+                <w:sz w:val="26"/>
+                <w:szCs w:val="26"/>
               </w:rPr>
               <w:instrText xml:space="preserve"> PAGEREF _Toc243990680 \h </w:instrText>
             </w:r>
             <w:r>
               <w:rPr>
                 <w:noProof/>
-              </w:rPr>
-            </w:r>
-            <w:r>
-              <w:rPr>
-                <w:noProof/>
+                <w:sz w:val="26"/>
+                <w:szCs w:val="26"/>
+              </w:rPr>
+            </w:r>
+            <w:r>
+              <w:rPr>
+                <w:noProof/>
+                <w:sz w:val="26"/>
+                <w:szCs w:val="26"/>
               </w:rPr>
               <w:fldChar w:fldCharType="separate"/>
             </w:r>
             <w:r>
               <w:rPr>
                 <w:noProof/>
+                <w:sz w:val="26"/>
+                <w:szCs w:val="26"/>
               </w:rPr>
               <w:t>19</w:t>
             </w:r>
             <w:r>
               <w:rPr>
                 <w:noProof/>
+                <w:sz w:val="26"/>
+                <w:szCs w:val="26"/>
               </w:rPr>
               <w:fldChar w:fldCharType="end"/>
             </w:r>
@@ -2924,8 +3622,8 @@
               <w:rFonts w:asciiTheme="minorHAnsi" w:eastAsiaTheme="minorEastAsia" w:hAnsiTheme="minorHAnsi" w:cstheme="minorBidi"/>
               <w:noProof/>
               <w:kern w:val="2"/>
-              <w:sz w:val="24"/>
-              <w:szCs w:val="24"/>
+              <w:sz w:val="26"/>
+              <w:szCs w:val="26"/>
               <w14:ligatures w14:val="standardContextual"/>
             </w:rPr>
           </w:pPr>
@@ -2934,47 +3632,63 @@
               <w:rPr>
                 <w:rStyle w:val="Hyperlink"/>
                 <w:noProof/>
+                <w:sz w:val="26"/>
+                <w:szCs w:val="26"/>
               </w:rPr>
               <w:t>12.5. Cập nhật sinh viên thành công</w:t>
             </w:r>
             <w:r>
               <w:rPr>
                 <w:noProof/>
+                <w:sz w:val="26"/>
+                <w:szCs w:val="26"/>
               </w:rPr>
               <w:tab/>
             </w:r>
             <w:r>
               <w:rPr>
                 <w:noProof/>
+                <w:sz w:val="26"/>
+                <w:szCs w:val="26"/>
               </w:rPr>
               <w:fldChar w:fldCharType="begin"/>
             </w:r>
             <w:r>
               <w:rPr>
                 <w:noProof/>
+                <w:sz w:val="26"/>
+                <w:szCs w:val="26"/>
               </w:rPr>
               <w:instrText xml:space="preserve"> PAGEREF _Toc243990681 \h </w:instrText>
             </w:r>
             <w:r>
               <w:rPr>
                 <w:noProof/>
-              </w:rPr>
-            </w:r>
-            <w:r>
-              <w:rPr>
-                <w:noProof/>
+                <w:sz w:val="26"/>
+                <w:szCs w:val="26"/>
+              </w:rPr>
+            </w:r>
+            <w:r>
+              <w:rPr>
+                <w:noProof/>
+                <w:sz w:val="26"/>
+                <w:szCs w:val="26"/>
               </w:rPr>
               <w:fldChar w:fldCharType="separate"/>
             </w:r>
             <w:r>
               <w:rPr>
                 <w:noProof/>
+                <w:sz w:val="26"/>
+                <w:szCs w:val="26"/>
               </w:rPr>
               <w:t>19</w:t>
             </w:r>
             <w:r>
               <w:rPr>
                 <w:noProof/>
+                <w:sz w:val="26"/>
+                <w:szCs w:val="26"/>
               </w:rPr>
               <w:fldChar w:fldCharType="end"/>
             </w:r>
@@ -2990,8 +3704,8 @@
               <w:rFonts w:asciiTheme="minorHAnsi" w:eastAsiaTheme="minorEastAsia" w:hAnsiTheme="minorHAnsi" w:cstheme="minorBidi"/>
               <w:noProof/>
               <w:kern w:val="2"/>
-              <w:sz w:val="24"/>
-              <w:szCs w:val="24"/>
+              <w:sz w:val="26"/>
+              <w:szCs w:val="26"/>
               <w14:ligatures w14:val="standardContextual"/>
             </w:rPr>
           </w:pPr>
@@ -3000,47 +3714,63 @@
               <w:rPr>
                 <w:rStyle w:val="Hyperlink"/>
                 <w:noProof/>
+                <w:sz w:val="26"/>
+                <w:szCs w:val="26"/>
               </w:rPr>
               <w:t>Bước 13. Kiểm thử tổng hợp hệ thống</w:t>
             </w:r>
             <w:r>
               <w:rPr>
                 <w:noProof/>
+                <w:sz w:val="26"/>
+                <w:szCs w:val="26"/>
               </w:rPr>
               <w:tab/>
             </w:r>
             <w:r>
               <w:rPr>
                 <w:noProof/>
+                <w:sz w:val="26"/>
+                <w:szCs w:val="26"/>
               </w:rPr>
               <w:fldChar w:fldCharType="begin"/>
             </w:r>
             <w:r>
               <w:rPr>
                 <w:noProof/>
+                <w:sz w:val="26"/>
+                <w:szCs w:val="26"/>
               </w:rPr>
               <w:instrText xml:space="preserve"> PAGEREF _Toc243990682 \h </w:instrText>
             </w:r>
             <w:r>
               <w:rPr>
                 <w:noProof/>
-              </w:rPr>
-            </w:r>
-            <w:r>
-              <w:rPr>
-                <w:noProof/>
+                <w:sz w:val="26"/>
+                <w:szCs w:val="26"/>
+              </w:rPr>
+            </w:r>
+            <w:r>
+              <w:rPr>
+                <w:noProof/>
+                <w:sz w:val="26"/>
+                <w:szCs w:val="26"/>
               </w:rPr>
               <w:fldChar w:fldCharType="separate"/>
             </w:r>
             <w:r>
               <w:rPr>
                 <w:noProof/>
+                <w:sz w:val="26"/>
+                <w:szCs w:val="26"/>
               </w:rPr>
               <w:t>20</w:t>
             </w:r>
             <w:r>
               <w:rPr>
                 <w:noProof/>
+                <w:sz w:val="26"/>
+                <w:szCs w:val="26"/>
               </w:rPr>
               <w:fldChar w:fldCharType="end"/>
             </w:r>
@@ -3056,8 +3786,8 @@
               <w:rFonts w:asciiTheme="minorHAnsi" w:eastAsiaTheme="minorEastAsia" w:hAnsiTheme="minorHAnsi" w:cstheme="minorBidi"/>
               <w:noProof/>
               <w:kern w:val="2"/>
-              <w:sz w:val="24"/>
-              <w:szCs w:val="24"/>
+              <w:sz w:val="26"/>
+              <w:szCs w:val="26"/>
               <w14:ligatures w14:val="standardContextual"/>
             </w:rPr>
           </w:pPr>
@@ -3066,47 +3796,63 @@
               <w:rPr>
                 <w:rStyle w:val="Hyperlink"/>
                 <w:noProof/>
+                <w:sz w:val="26"/>
+                <w:szCs w:val="26"/>
               </w:rPr>
               <w:t>13.1. Bảng dữ liệu trong SQL Server</w:t>
             </w:r>
             <w:r>
               <w:rPr>
                 <w:noProof/>
+                <w:sz w:val="26"/>
+                <w:szCs w:val="26"/>
               </w:rPr>
               <w:tab/>
             </w:r>
             <w:r>
               <w:rPr>
                 <w:noProof/>
+                <w:sz w:val="26"/>
+                <w:szCs w:val="26"/>
               </w:rPr>
               <w:fldChar w:fldCharType="begin"/>
             </w:r>
             <w:r>
               <w:rPr>
                 <w:noProof/>
+                <w:sz w:val="26"/>
+                <w:szCs w:val="26"/>
               </w:rPr>
               <w:instrText xml:space="preserve"> PAGEREF _Toc243990683 \h </w:instrText>
             </w:r>
             <w:r>
               <w:rPr>
                 <w:noProof/>
-              </w:rPr>
-            </w:r>
-            <w:r>
-              <w:rPr>
-                <w:noProof/>
+                <w:sz w:val="26"/>
+                <w:szCs w:val="26"/>
+              </w:rPr>
+            </w:r>
+            <w:r>
+              <w:rPr>
+                <w:noProof/>
+                <w:sz w:val="26"/>
+                <w:szCs w:val="26"/>
               </w:rPr>
               <w:fldChar w:fldCharType="separate"/>
             </w:r>
             <w:r>
               <w:rPr>
                 <w:noProof/>
+                <w:sz w:val="26"/>
+                <w:szCs w:val="26"/>
               </w:rPr>
               <w:t>20</w:t>
             </w:r>
             <w:r>
               <w:rPr>
                 <w:noProof/>
+                <w:sz w:val="26"/>
+                <w:szCs w:val="26"/>
               </w:rPr>
               <w:fldChar w:fldCharType="end"/>
             </w:r>
@@ -3122,8 +3868,8 @@
               <w:rFonts w:asciiTheme="minorHAnsi" w:eastAsiaTheme="minorEastAsia" w:hAnsiTheme="minorHAnsi" w:cstheme="minorBidi"/>
               <w:noProof/>
               <w:kern w:val="2"/>
-              <w:sz w:val="24"/>
-              <w:szCs w:val="24"/>
+              <w:sz w:val="26"/>
+              <w:szCs w:val="26"/>
               <w14:ligatures w14:val="standardContextual"/>
             </w:rPr>
           </w:pPr>
@@ -3132,47 +3878,63 @@
               <w:rPr>
                 <w:rStyle w:val="Hyperlink"/>
                 <w:noProof/>
+                <w:sz w:val="26"/>
+                <w:szCs w:val="26"/>
               </w:rPr>
               <w:t>13.2. Kiểm tra Bootstrap hoạt động Offline</w:t>
             </w:r>
             <w:r>
               <w:rPr>
                 <w:noProof/>
+                <w:sz w:val="26"/>
+                <w:szCs w:val="26"/>
               </w:rPr>
               <w:tab/>
             </w:r>
             <w:r>
               <w:rPr>
                 <w:noProof/>
+                <w:sz w:val="26"/>
+                <w:szCs w:val="26"/>
               </w:rPr>
               <w:fldChar w:fldCharType="begin"/>
             </w:r>
             <w:r>
               <w:rPr>
                 <w:noProof/>
+                <w:sz w:val="26"/>
+                <w:szCs w:val="26"/>
               </w:rPr>
               <w:instrText xml:space="preserve"> PAGEREF _Toc243990684 \h </w:instrText>
             </w:r>
             <w:r>
               <w:rPr>
                 <w:noProof/>
-              </w:rPr>
-            </w:r>
-            <w:r>
-              <w:rPr>
-                <w:noProof/>
+                <w:sz w:val="26"/>
+                <w:szCs w:val="26"/>
+              </w:rPr>
+            </w:r>
+            <w:r>
+              <w:rPr>
+                <w:noProof/>
+                <w:sz w:val="26"/>
+                <w:szCs w:val="26"/>
               </w:rPr>
               <w:fldChar w:fldCharType="separate"/>
             </w:r>
             <w:r>
               <w:rPr>
                 <w:noProof/>
+                <w:sz w:val="26"/>
+                <w:szCs w:val="26"/>
               </w:rPr>
               <w:t>20</w:t>
             </w:r>
             <w:r>
               <w:rPr>
                 <w:noProof/>
+                <w:sz w:val="26"/>
+                <w:szCs w:val="26"/>
               </w:rPr>
               <w:fldChar w:fldCharType="end"/>
             </w:r>
@@ -3188,8 +3950,8 @@
               <w:rFonts w:asciiTheme="minorHAnsi" w:eastAsiaTheme="minorEastAsia" w:hAnsiTheme="minorHAnsi" w:cstheme="minorBidi"/>
               <w:noProof/>
               <w:kern w:val="2"/>
-              <w:sz w:val="24"/>
-              <w:szCs w:val="24"/>
+              <w:sz w:val="26"/>
+              <w:szCs w:val="26"/>
               <w14:ligatures w14:val="standardContextual"/>
             </w:rPr>
           </w:pPr>
@@ -3198,47 +3960,63 @@
               <w:rPr>
                 <w:rStyle w:val="Hyperlink"/>
                 <w:noProof/>
+                <w:sz w:val="26"/>
+                <w:szCs w:val="26"/>
               </w:rPr>
               <w:t>13.3. Thử nghiệm Thêm mới sinh viên thành công</w:t>
             </w:r>
             <w:r>
               <w:rPr>
                 <w:noProof/>
+                <w:sz w:val="26"/>
+                <w:szCs w:val="26"/>
               </w:rPr>
               <w:tab/>
             </w:r>
             <w:r>
               <w:rPr>
                 <w:noProof/>
+                <w:sz w:val="26"/>
+                <w:szCs w:val="26"/>
               </w:rPr>
               <w:fldChar w:fldCharType="begin"/>
             </w:r>
             <w:r>
               <w:rPr>
                 <w:noProof/>
+                <w:sz w:val="26"/>
+                <w:szCs w:val="26"/>
               </w:rPr>
               <w:instrText xml:space="preserve"> PAGEREF _Toc243990685 \h </w:instrText>
             </w:r>
             <w:r>
               <w:rPr>
                 <w:noProof/>
-              </w:rPr>
-            </w:r>
-            <w:r>
-              <w:rPr>
-                <w:noProof/>
+                <w:sz w:val="26"/>
+                <w:szCs w:val="26"/>
+              </w:rPr>
+            </w:r>
+            <w:r>
+              <w:rPr>
+                <w:noProof/>
+                <w:sz w:val="26"/>
+                <w:szCs w:val="26"/>
               </w:rPr>
               <w:fldChar w:fldCharType="separate"/>
             </w:r>
             <w:r>
               <w:rPr>
                 <w:noProof/>
+                <w:sz w:val="26"/>
+                <w:szCs w:val="26"/>
               </w:rPr>
               <w:t>21</w:t>
             </w:r>
             <w:r>
               <w:rPr>
                 <w:noProof/>
+                <w:sz w:val="26"/>
+                <w:szCs w:val="26"/>
               </w:rPr>
               <w:fldChar w:fldCharType="end"/>
             </w:r>
@@ -3254,8 +4032,8 @@
               <w:rFonts w:asciiTheme="minorHAnsi" w:eastAsiaTheme="minorEastAsia" w:hAnsiTheme="minorHAnsi" w:cstheme="minorBidi"/>
               <w:noProof/>
               <w:kern w:val="2"/>
-              <w:sz w:val="24"/>
-              <w:szCs w:val="24"/>
+              <w:sz w:val="26"/>
+              <w:szCs w:val="26"/>
               <w14:ligatures w14:val="standardContextual"/>
             </w:rPr>
           </w:pPr>
@@ -3264,47 +4042,63 @@
               <w:rPr>
                 <w:rStyle w:val="Hyperlink"/>
                 <w:noProof/>
+                <w:sz w:val="26"/>
+                <w:szCs w:val="26"/>
               </w:rPr>
               <w:t>13.4. Thử nghiệm Cập nhật sinh viên thành công</w:t>
             </w:r>
             <w:r>
               <w:rPr>
                 <w:noProof/>
+                <w:sz w:val="26"/>
+                <w:szCs w:val="26"/>
               </w:rPr>
               <w:tab/>
             </w:r>
             <w:r>
               <w:rPr>
                 <w:noProof/>
+                <w:sz w:val="26"/>
+                <w:szCs w:val="26"/>
               </w:rPr>
               <w:fldChar w:fldCharType="begin"/>
             </w:r>
             <w:r>
               <w:rPr>
                 <w:noProof/>
+                <w:sz w:val="26"/>
+                <w:szCs w:val="26"/>
               </w:rPr>
               <w:instrText xml:space="preserve"> PAGEREF _Toc243990686 \h </w:instrText>
             </w:r>
             <w:r>
               <w:rPr>
                 <w:noProof/>
-              </w:rPr>
-            </w:r>
-            <w:r>
-              <w:rPr>
-                <w:noProof/>
+                <w:sz w:val="26"/>
+                <w:szCs w:val="26"/>
+              </w:rPr>
+            </w:r>
+            <w:r>
+              <w:rPr>
+                <w:noProof/>
+                <w:sz w:val="26"/>
+                <w:szCs w:val="26"/>
               </w:rPr>
               <w:fldChar w:fldCharType="separate"/>
             </w:r>
             <w:r>
               <w:rPr>
                 <w:noProof/>
+                <w:sz w:val="26"/>
+                <w:szCs w:val="26"/>
               </w:rPr>
               <w:t>21</w:t>
             </w:r>
             <w:r>
               <w:rPr>
                 <w:noProof/>
+                <w:sz w:val="26"/>
+                <w:szCs w:val="26"/>
               </w:rPr>
               <w:fldChar w:fldCharType="end"/>
             </w:r>
@@ -3320,8 +4114,8 @@
               <w:rFonts w:asciiTheme="minorHAnsi" w:eastAsiaTheme="minorEastAsia" w:hAnsiTheme="minorHAnsi" w:cstheme="minorBidi"/>
               <w:noProof/>
               <w:kern w:val="2"/>
-              <w:sz w:val="24"/>
-              <w:szCs w:val="24"/>
+              <w:sz w:val="26"/>
+              <w:szCs w:val="26"/>
               <w14:ligatures w14:val="standardContextual"/>
             </w:rPr>
           </w:pPr>
@@ -3330,47 +4124,63 @@
               <w:rPr>
                 <w:rStyle w:val="Hyperlink"/>
                 <w:noProof/>
+                <w:sz w:val="26"/>
+                <w:szCs w:val="26"/>
               </w:rPr>
               <w:t>13.5. Thử nghiệm Xóa sinh viên thành công</w:t>
             </w:r>
             <w:r>
               <w:rPr>
                 <w:noProof/>
+                <w:sz w:val="26"/>
+                <w:szCs w:val="26"/>
               </w:rPr>
               <w:tab/>
             </w:r>
             <w:r>
               <w:rPr>
                 <w:noProof/>
+                <w:sz w:val="26"/>
+                <w:szCs w:val="26"/>
               </w:rPr>
               <w:fldChar w:fldCharType="begin"/>
             </w:r>
             <w:r>
               <w:rPr>
                 <w:noProof/>
+                <w:sz w:val="26"/>
+                <w:szCs w:val="26"/>
               </w:rPr>
               <w:instrText xml:space="preserve"> PAGEREF _Toc243990687 \h </w:instrText>
             </w:r>
             <w:r>
               <w:rPr>
                 <w:noProof/>
-              </w:rPr>
-            </w:r>
-            <w:r>
-              <w:rPr>
-                <w:noProof/>
+                <w:sz w:val="26"/>
+                <w:szCs w:val="26"/>
+              </w:rPr>
+            </w:r>
+            <w:r>
+              <w:rPr>
+                <w:noProof/>
+                <w:sz w:val="26"/>
+                <w:szCs w:val="26"/>
               </w:rPr>
               <w:fldChar w:fldCharType="separate"/>
             </w:r>
             <w:r>
               <w:rPr>
                 <w:noProof/>
+                <w:sz w:val="26"/>
+                <w:szCs w:val="26"/>
               </w:rPr>
               <w:t>22</w:t>
             </w:r>
             <w:r>
               <w:rPr>
                 <w:noProof/>
+                <w:sz w:val="26"/>
+                <w:szCs w:val="26"/>
               </w:rPr>
               <w:fldChar w:fldCharType="end"/>
             </w:r>
@@ -3378,6 +4188,10 @@
         </w:p>
         <w:p>
           <w:r>
+            <w:rPr>
+              <w:sz w:val="26"/>
+              <w:szCs w:val="26"/>
+            </w:rPr>
             <w:fldChar w:fldCharType="end"/>
           </w:r>
         </w:p>
@@ -7936,6 +8750,7 @@
   <w:style w:type="character" w:default="1" w:styleId="DefaultParagraphFont">
     <w:name w:val="Default Paragraph Font"/>
     <w:uiPriority w:val="1"/>
+    <w:semiHidden/>
     <w:unhideWhenUsed/>
   </w:style>
   <w:style w:type="table" w:default="1" w:styleId="TableNormal">

</xml_diff>